<commit_message>
Add interview-evidence case for HushPlate as section 2 of evidence doc
Co-Authored-By: Claude Opus 5.5 <noreply@anthropic.com>
</commit_message>
<xml_diff>
--- a/07_DietGroceryApp/research/InterviewEvidenceWrong_Research.docx
+++ b/07_DietGroceryApp/research/InterviewEvidenceWrong_Research.docx
@@ -3195,6 +3195,3536 @@
     <w:p>
       <w:r>
         <w:t xml:space="preserve">All of these weaken the case *for* HushPlate just as much as the case against it. None of them is evidence that the idea is right.</w:t>
+      </w:r>
+    </w:p>
+    <w:p>
+      <w:r>
+        <w:br w:type="page"/>
+      </w:r>
+    </w:p>
+    <w:p>
+      <w:pPr>
+        <w:pStyle w:val="Title"/>
+      </w:pPr>
+      <w:r>
+        <w:t xml:space="preserve">The Case For Building HushPlate (Interview Evidence Only)</w:t>
+      </w:r>
+    </w:p>
+    <w:p>
+      <w:r>
+        <w:rPr>
+          <w:b/>
+        </w:rPr>
+        <w:t xml:space="preserve">Prepared:</w:t>
+      </w:r>
+      <w:r>
+        <w:t xml:space="preserve"> 2026-10-06 · </w:t>
+      </w:r>
+      <w:r>
+        <w:rPr>
+          <w:b/>
+        </w:rPr>
+        <w:t xml:space="preserve">Project:</w:t>
+      </w:r>
+      <w:r>
+        <w:t xml:space="preserve"> 07_DietGroceryApp (HushPlate) · </w:t>
+      </w:r>
+      <w:r>
+        <w:rPr>
+          <w:b/>
+        </w:rPr>
+        <w:t xml:space="preserve">Source:</w:t>
+      </w:r>
+      <w:r>
+        <w:t xml:space="preserve"> the same 20 interviews as </w:t>
+      </w:r>
+      <w:hyperlink r:id="rHl1">
+        <w:r>
+          <w:rPr>
+            <w:rStyle w:val="Hyperlink"/>
+          </w:rPr>
+          <w:t xml:space="preserve">interview-synthesis.md</w:t>
+        </w:r>
+      </w:hyperlink>
+      <w:r>
+        <w:t xml:space="preserve"> (IDs I1–I20 follow the key there)</w:t>
+      </w:r>
+    </w:p>
+    <w:p>
+      <w:r>
+        <w:rPr>
+          <w:b/>
+        </w:rPr>
+        <w:t xml:space="preserve">Brief:</w:t>
+      </w:r>
+      <w:r>
+        <w:t xml:space="preserve"> Argue that the idea is right using only what the 20 interviewees said. No market data, competitor research or outside sources. Quotes are copied exactly as recorded. This section is the counterpart to the case against above, and it answers that case point by point at the end.</w:t>
+      </w:r>
+    </w:p>
+    <w:p>
+      <w:pPr>
+        <w:pStyle w:val="Heading1"/>
+      </w:pPr>
+      <w:r>
+        <w:t xml:space="preserve">The verdict</w:t>
+      </w:r>
+    </w:p>
+    <w:p>
+      <w:r>
+        <w:t xml:space="preserve">The most common pain in the interviews is a lack of </w:t>
+      </w:r>
+      <w:r>
+        <w:rPr>
+          <w:b/>
+        </w:rPr>
+        <w:t xml:space="preserve">time and energy</w:t>
+      </w:r>
+      <w:r>
+        <w:t xml:space="preserve"> (12 of 20). In several of those stories, the interviewee said in their own words that the step they ran out of energy for was </w:t>
+      </w:r>
+      <w:r>
+        <w:rPr>
+          <w:b/>
+        </w:rPr>
+        <w:t xml:space="preserve">planning</w:t>
+      </w:r>
+      <w:r>
+        <w:t xml:space="preserve">. The people who plan ahead eat well, and the people who don't plan fall back on fast food. Interviewees already juggle TikTok, Google, ChatGPT and Pinterest for recipes and keep nutrition targets in their heads. Some already build a grocery list in a store app over several days and order it for pickup. HushPlate automates the habit that already works for the planners, for people who run out of time to do it themselves.</w:t>
+      </w:r>
+    </w:p>
+    <w:tbl>
+      <w:tblPr>
+        <w:tblW w:w="10080" w:type="dxa"/>
+        <w:tblBorders>
+          <w:top w:val="single" w:sz="4" w:space="0" w:color="C9CCD1"/>
+          <w:left w:val="single" w:sz="4" w:space="0" w:color="C9CCD1"/>
+          <w:bottom w:val="single" w:sz="4" w:space="0" w:color="C9CCD1"/>
+          <w:right w:val="single" w:sz="4" w:space="0" w:color="C9CCD1"/>
+          <w:insideH w:val="single" w:sz="4" w:space="0" w:color="C9CCD1"/>
+          <w:insideV w:val="single" w:sz="4" w:space="0" w:color="C9CCD1"/>
+        </w:tblBorders>
+        <w:tblLayout w:type="fixed"/>
+      </w:tblPr>
+      <w:tblGrid>
+        <w:gridCol w:w="2520"/>
+        <w:gridCol w:w="2520"/>
+        <w:gridCol w:w="2520"/>
+        <w:gridCol w:w="2520"/>
+      </w:tblGrid>
+      <w:tr>
+        <w:trPr>
+          <w:tblHeader/>
+        </w:trPr>
+        <w:tc>
+          <w:tcPr>
+            <w:tcW w:w="2520" w:type="dxa"/>
+            <w:shd w:val="clear" w:color="auto" w:fill="EFF1F3"/>
+          </w:tcPr>
+          <w:p>
+            <w:pPr>
+              <w:spacing w:before="40" w:after="40"/>
+            </w:pPr>
+            <w:r>
+              <w:rPr>
+                <w:b/>
+                <w:sz w:val="18"/>
+              </w:rPr>
+              <w:t xml:space="preserve">#</w:t>
+            </w:r>
+          </w:p>
+        </w:tc>
+        <w:tc>
+          <w:tcPr>
+            <w:tcW w:w="2520" w:type="dxa"/>
+            <w:shd w:val="clear" w:color="auto" w:fill="EFF1F3"/>
+          </w:tcPr>
+          <w:p>
+            <w:pPr>
+              <w:spacing w:before="40" w:after="40"/>
+            </w:pPr>
+            <w:r>
+              <w:rPr>
+                <w:b/>
+                <w:sz w:val="18"/>
+              </w:rPr>
+              <w:t xml:space="preserve">What HushPlate needs to be true</w:t>
+            </w:r>
+          </w:p>
+        </w:tc>
+        <w:tc>
+          <w:tcPr>
+            <w:tcW w:w="2520" w:type="dxa"/>
+            <w:shd w:val="clear" w:color="auto" w:fill="EFF1F3"/>
+          </w:tcPr>
+          <w:p>
+            <w:pPr>
+              <w:spacing w:before="40" w:after="40"/>
+            </w:pPr>
+            <w:r>
+              <w:rPr>
+                <w:b/>
+                <w:sz w:val="18"/>
+              </w:rPr>
+              <w:t xml:space="preserve">What the interviews show</w:t>
+            </w:r>
+          </w:p>
+        </w:tc>
+        <w:tc>
+          <w:tcPr>
+            <w:tcW w:w="2520" w:type="dxa"/>
+            <w:shd w:val="clear" w:color="auto" w:fill="EFF1F3"/>
+          </w:tcPr>
+          <w:p>
+            <w:pPr>
+              <w:spacing w:before="40" w:after="40"/>
+            </w:pPr>
+            <w:r>
+              <w:rPr>
+                <w:b/>
+                <w:sz w:val="18"/>
+              </w:rPr>
+              <w:t xml:space="preserve">Interviews</w:t>
+            </w:r>
+          </w:p>
+        </w:tc>
+      </w:tr>
+      <w:tr>
+        <w:tc>
+          <w:tcPr>
+            <w:tcW w:w="2520" w:type="dxa"/>
+          </w:tcPr>
+          <w:p>
+            <w:pPr>
+              <w:spacing w:before="40" w:after="40"/>
+            </w:pPr>
+            <w:r>
+              <w:rPr>
+                <w:sz w:val="18"/>
+              </w:rPr>
+              <w:t xml:space="preserve">1</w:t>
+            </w:r>
+          </w:p>
+        </w:tc>
+        <w:tc>
+          <w:tcPr>
+            <w:tcW w:w="2520" w:type="dxa"/>
+          </w:tcPr>
+          <w:p>
+            <w:pPr>
+              <w:spacing w:before="40" w:after="40"/>
+            </w:pPr>
+            <w:r>
+              <w:rPr>
+                <w:sz w:val="18"/>
+              </w:rPr>
+              <w:t xml:space="preserve">There's a costly, frequent pain</w:t>
+            </w:r>
+          </w:p>
+        </w:tc>
+        <w:tc>
+          <w:tcPr>
+            <w:tcW w:w="2520" w:type="dxa"/>
+          </w:tcPr>
+          <w:p>
+            <w:pPr>
+              <w:spacing w:before="40" w:after="40"/>
+            </w:pPr>
+            <w:r>
+              <w:rPr>
+                <w:sz w:val="18"/>
+              </w:rPr>
+              <w:t xml:space="preserve">Time and energy run out, so they get fast food</w:t>
+            </w:r>
+          </w:p>
+        </w:tc>
+        <w:tc>
+          <w:tcPr>
+            <w:tcW w:w="2520" w:type="dxa"/>
+          </w:tcPr>
+          <w:p>
+            <w:pPr>
+              <w:spacing w:before="40" w:after="40"/>
+            </w:pPr>
+            <w:r>
+              <w:rPr>
+                <w:sz w:val="18"/>
+              </w:rPr>
+              <w:t xml:space="preserve">12 of 20</w:t>
+            </w:r>
+          </w:p>
+        </w:tc>
+      </w:tr>
+      <w:tr>
+        <w:tc>
+          <w:tcPr>
+            <w:tcW w:w="2520" w:type="dxa"/>
+          </w:tcPr>
+          <w:p>
+            <w:pPr>
+              <w:spacing w:before="40" w:after="40"/>
+            </w:pPr>
+            <w:r>
+              <w:rPr>
+                <w:sz w:val="18"/>
+              </w:rPr>
+              <w:t xml:space="preserve">2</w:t>
+            </w:r>
+          </w:p>
+        </w:tc>
+        <w:tc>
+          <w:tcPr>
+            <w:tcW w:w="2520" w:type="dxa"/>
+          </w:tcPr>
+          <w:p>
+            <w:pPr>
+              <w:spacing w:before="40" w:after="40"/>
+            </w:pPr>
+            <w:r>
+              <w:rPr>
+                <w:sz w:val="18"/>
+              </w:rPr>
+              <w:t xml:space="preserve">Planning makes the difference</w:t>
+            </w:r>
+          </w:p>
+        </w:tc>
+        <w:tc>
+          <w:tcPr>
+            <w:tcW w:w="2520" w:type="dxa"/>
+          </w:tcPr>
+          <w:p>
+            <w:pPr>
+              <w:spacing w:before="40" w:after="40"/>
+            </w:pPr>
+            <w:r>
+              <w:rPr>
+                <w:sz w:val="18"/>
+              </w:rPr>
+              <w:t xml:space="preserve">People who plan ahead stick to it; people who don't, don't</w:t>
+            </w:r>
+          </w:p>
+        </w:tc>
+        <w:tc>
+          <w:tcPr>
+            <w:tcW w:w="2520" w:type="dxa"/>
+          </w:tcPr>
+          <w:p>
+            <w:pPr>
+              <w:spacing w:before="40" w:after="40"/>
+            </w:pPr>
+            <w:r>
+              <w:rPr>
+                <w:sz w:val="18"/>
+              </w:rPr>
+              <w:t xml:space="preserve">I1, I4, I7, I12, I16, I17</w:t>
+            </w:r>
+          </w:p>
+        </w:tc>
+      </w:tr>
+      <w:tr>
+        <w:tc>
+          <w:tcPr>
+            <w:tcW w:w="2520" w:type="dxa"/>
+          </w:tcPr>
+          <w:p>
+            <w:pPr>
+              <w:spacing w:before="40" w:after="40"/>
+            </w:pPr>
+            <w:r>
+              <w:rPr>
+                <w:sz w:val="18"/>
+              </w:rPr>
+              <w:t xml:space="preserve">3</w:t>
+            </w:r>
+          </w:p>
+        </w:tc>
+        <w:tc>
+          <w:tcPr>
+            <w:tcW w:w="2520" w:type="dxa"/>
+          </w:tcPr>
+          <w:p>
+            <w:pPr>
+              <w:spacing w:before="40" w:after="40"/>
+            </w:pPr>
+            <w:r>
+              <w:rPr>
+                <w:sz w:val="18"/>
+              </w:rPr>
+              <w:t xml:space="preserve">The tools they use now are scattered</w:t>
+            </w:r>
+          </w:p>
+        </w:tc>
+        <w:tc>
+          <w:tcPr>
+            <w:tcW w:w="2520" w:type="dxa"/>
+          </w:tcPr>
+          <w:p>
+            <w:pPr>
+              <w:spacing w:before="40" w:after="40"/>
+            </w:pPr>
+            <w:r>
+              <w:rPr>
+                <w:sz w:val="18"/>
+              </w:rPr>
+              <w:t xml:space="preserve">Recipes come from 4+ places, targets are kept in their heads, lists are on paper</w:t>
+            </w:r>
+          </w:p>
+        </w:tc>
+        <w:tc>
+          <w:tcPr>
+            <w:tcW w:w="2520" w:type="dxa"/>
+          </w:tcPr>
+          <w:p>
+            <w:pPr>
+              <w:spacing w:before="40" w:after="40"/>
+            </w:pPr>
+            <w:r>
+              <w:rPr>
+                <w:sz w:val="18"/>
+              </w:rPr>
+              <w:t xml:space="preserve">3 use multiple recipe sources; 4 keep a mental tally</w:t>
+            </w:r>
+          </w:p>
+        </w:tc>
+      </w:tr>
+      <w:tr>
+        <w:tc>
+          <w:tcPr>
+            <w:tcW w:w="2520" w:type="dxa"/>
+          </w:tcPr>
+          <w:p>
+            <w:pPr>
+              <w:spacing w:before="40" w:after="40"/>
+            </w:pPr>
+            <w:r>
+              <w:rPr>
+                <w:sz w:val="18"/>
+              </w:rPr>
+              <w:t xml:space="preserve">4</w:t>
+            </w:r>
+          </w:p>
+        </w:tc>
+        <w:tc>
+          <w:tcPr>
+            <w:tcW w:w="2520" w:type="dxa"/>
+          </w:tcPr>
+          <w:p>
+            <w:pPr>
+              <w:spacing w:before="40" w:after="40"/>
+            </w:pPr>
+            <w:r>
+              <w:rPr>
+                <w:sz w:val="18"/>
+              </w:rPr>
+              <w:t xml:space="preserve">Targets matter when choosing meals</w:t>
+            </w:r>
+          </w:p>
+        </w:tc>
+        <w:tc>
+          <w:tcPr>
+            <w:tcW w:w="2520" w:type="dxa"/>
+          </w:tcPr>
+          <w:p>
+            <w:pPr>
+              <w:spacing w:before="40" w:after="40"/>
+            </w:pPr>
+            <w:r>
+              <w:rPr>
+                <w:sz w:val="18"/>
+              </w:rPr>
+              <w:t xml:space="preserve">People manage protein, macros, fiber and calories, by hand</w:t>
+            </w:r>
+          </w:p>
+        </w:tc>
+        <w:tc>
+          <w:tcPr>
+            <w:tcW w:w="2520" w:type="dxa"/>
+          </w:tcPr>
+          <w:p>
+            <w:pPr>
+              <w:spacing w:before="40" w:after="40"/>
+            </w:pPr>
+            <w:r>
+              <w:rPr>
+                <w:sz w:val="18"/>
+              </w:rPr>
+              <w:t xml:space="preserve">8 of 20</w:t>
+            </w:r>
+          </w:p>
+        </w:tc>
+      </w:tr>
+      <w:tr>
+        <w:tc>
+          <w:tcPr>
+            <w:tcW w:w="2520" w:type="dxa"/>
+          </w:tcPr>
+          <w:p>
+            <w:pPr>
+              <w:spacing w:before="40" w:after="40"/>
+            </w:pPr>
+            <w:r>
+              <w:rPr>
+                <w:sz w:val="18"/>
+              </w:rPr>
+              <w:t xml:space="preserve">5</w:t>
+            </w:r>
+          </w:p>
+        </w:tc>
+        <w:tc>
+          <w:tcPr>
+            <w:tcW w:w="2520" w:type="dxa"/>
+          </w:tcPr>
+          <w:p>
+            <w:pPr>
+              <w:spacing w:before="40" w:after="40"/>
+            </w:pPr>
+            <w:r>
+              <w:rPr>
+                <w:sz w:val="18"/>
+              </w:rPr>
+              <w:t xml:space="preserve">People order groceries digitally</w:t>
+            </w:r>
+          </w:p>
+        </w:tc>
+        <w:tc>
+          <w:tcPr>
+            <w:tcW w:w="2520" w:type="dxa"/>
+          </w:tcPr>
+          <w:p>
+            <w:pPr>
+              <w:spacing w:before="40" w:after="40"/>
+            </w:pPr>
+            <w:r>
+              <w:rPr>
+                <w:sz w:val="18"/>
+              </w:rPr>
+              <w:t xml:space="preserve">Pickup, curbside, store apps and online orders are already in use</w:t>
+            </w:r>
+          </w:p>
+        </w:tc>
+        <w:tc>
+          <w:tcPr>
+            <w:tcW w:w="2520" w:type="dxa"/>
+          </w:tcPr>
+          <w:p>
+            <w:pPr>
+              <w:spacing w:before="40" w:after="40"/>
+            </w:pPr>
+            <w:r>
+              <w:rPr>
+                <w:sz w:val="18"/>
+              </w:rPr>
+              <w:t xml:space="preserve">6 of 20</w:t>
+            </w:r>
+          </w:p>
+        </w:tc>
+      </w:tr>
+      <w:tr>
+        <w:tc>
+          <w:tcPr>
+            <w:tcW w:w="2520" w:type="dxa"/>
+          </w:tcPr>
+          <w:p>
+            <w:pPr>
+              <w:spacing w:before="40" w:after="40"/>
+            </w:pPr>
+            <w:r>
+              <w:rPr>
+                <w:sz w:val="18"/>
+              </w:rPr>
+              <w:t xml:space="preserve">6</w:t>
+            </w:r>
+          </w:p>
+        </w:tc>
+        <w:tc>
+          <w:tcPr>
+            <w:tcW w:w="2520" w:type="dxa"/>
+          </w:tcPr>
+          <w:p>
+            <w:pPr>
+              <w:spacing w:before="40" w:after="40"/>
+            </w:pPr>
+            <w:r>
+              <w:rPr>
+                <w:sz w:val="18"/>
+              </w:rPr>
+              <w:t xml:space="preserve">They accept AI or "do it for me"</w:t>
+            </w:r>
+          </w:p>
+        </w:tc>
+        <w:tc>
+          <w:tcPr>
+            <w:tcW w:w="2520" w:type="dxa"/>
+          </w:tcPr>
+          <w:p>
+            <w:pPr>
+              <w:spacing w:before="40" w:after="40"/>
+            </w:pPr>
+            <w:r>
+              <w:rPr>
+                <w:sz w:val="18"/>
+              </w:rPr>
+              <w:t xml:space="preserve">Some have asked for it in their own words or already use it</w:t>
+            </w:r>
+          </w:p>
+        </w:tc>
+        <w:tc>
+          <w:tcPr>
+            <w:tcW w:w="2520" w:type="dxa"/>
+          </w:tcPr>
+          <w:p>
+            <w:pPr>
+              <w:spacing w:before="40" w:after="40"/>
+            </w:pPr>
+            <w:r>
+              <w:rPr>
+                <w:sz w:val="18"/>
+              </w:rPr>
+              <w:t xml:space="preserve">I1, I4, I10, I13</w:t>
+            </w:r>
+          </w:p>
+        </w:tc>
+      </w:tr>
+      <w:tr>
+        <w:tc>
+          <w:tcPr>
+            <w:tcW w:w="2520" w:type="dxa"/>
+          </w:tcPr>
+          <w:p>
+            <w:pPr>
+              <w:spacing w:before="40" w:after="40"/>
+            </w:pPr>
+            <w:r>
+              <w:rPr>
+                <w:sz w:val="18"/>
+              </w:rPr>
+              <w:t xml:space="preserve">7</w:t>
+            </w:r>
+          </w:p>
+        </w:tc>
+        <w:tc>
+          <w:tcPr>
+            <w:tcW w:w="2520" w:type="dxa"/>
+          </w:tcPr>
+          <w:p>
+            <w:pPr>
+              <w:spacing w:before="40" w:after="40"/>
+            </w:pPr>
+            <w:r>
+              <w:rPr>
+                <w:sz w:val="18"/>
+              </w:rPr>
+              <w:t xml:space="preserve">Money is going to this problem</w:t>
+            </w:r>
+          </w:p>
+        </w:tc>
+        <w:tc>
+          <w:tcPr>
+            <w:tcW w:w="2520" w:type="dxa"/>
+          </w:tcPr>
+          <w:p>
+            <w:pPr>
+              <w:spacing w:before="40" w:after="40"/>
+            </w:pPr>
+            <w:r>
+              <w:rPr>
+                <w:sz w:val="18"/>
+              </w:rPr>
+              <w:t xml:space="preserve">GLP-1s, dietitians, convenience food, recipe and diet subscriptions</w:t>
+            </w:r>
+          </w:p>
+        </w:tc>
+        <w:tc>
+          <w:tcPr>
+            <w:tcW w:w="2520" w:type="dxa"/>
+          </w:tcPr>
+          <w:p>
+            <w:pPr>
+              <w:spacing w:before="40" w:after="40"/>
+            </w:pPr>
+            <w:r>
+              <w:rPr>
+                <w:sz w:val="18"/>
+              </w:rPr>
+              <w:t xml:space="preserve">8 of 20</w:t>
+            </w:r>
+          </w:p>
+        </w:tc>
+      </w:tr>
+    </w:tbl>
+    <w:p>
+      <w:pPr>
+        <w:spacing w:after="0"/>
+      </w:pPr>
+    </w:p>
+    <w:p>
+      <w:pPr>
+        <w:pBdr>
+          <w:bottom w:val="single" w:sz="6" w:space="6" w:color="C9CCD1"/>
+        </w:pBdr>
+      </w:pPr>
+    </w:p>
+    <w:p>
+      <w:pPr>
+        <w:pStyle w:val="Heading1"/>
+      </w:pPr>
+      <w:r>
+        <w:t xml:space="preserve">Argument 1: The top pain is running out of time and energy, and planning is what goes first</w:t>
+      </w:r>
+    </w:p>
+    <w:p>
+      <w:r>
+        <w:t xml:space="preserve">Running out of time or energy was the most common pain in the interviews (12 of 20: I2, I3, I4, I6, I12, I13, I14, I15, I16, I17, I18, I19). Several people named </w:t>
+      </w:r>
+      <w:r>
+        <w:rPr>
+          <w:b/>
+        </w:rPr>
+        <w:t xml:space="preserve">planning and deciding</w:t>
+      </w:r>
+      <w:r>
+        <w:t xml:space="preserve"> as the step they dropped:</w:t>
+      </w:r>
+    </w:p>
+    <w:p>
+      <w:pPr>
+        <w:numPr>
+          <w:ilvl w:val="0"/>
+          <w:numId w:val="1"/>
+        </w:numPr>
+      </w:pPr>
+      <w:r>
+        <w:t xml:space="preserve">"The lack of free time or energy caused me to miss my meal planning for the next day and miss breakfast and sometimes lunch." (I16)</w:t>
+      </w:r>
+    </w:p>
+    <w:p>
+      <w:pPr>
+        <w:numPr>
+          <w:ilvl w:val="0"/>
+          <w:numId w:val="1"/>
+        </w:numPr>
+      </w:pPr>
+      <w:r>
+        <w:t xml:space="preserve">"I made breakfast for the first two days, but ran out of time in the middle of the week due to staying out of the house late and not having energy to meal plan. Those day, I got takeout." (I16)</w:t>
+      </w:r>
+    </w:p>
+    <w:p>
+      <w:pPr>
+        <w:numPr>
+          <w:ilvl w:val="0"/>
+          <w:numId w:val="1"/>
+        </w:numPr>
+      </w:pPr>
+      <w:r>
+        <w:t xml:space="preserve">"There is not a lot of time to decide what to make. Spure of moment decisions… Last second go somewhere and get something." (I4)</w:t>
+      </w:r>
+    </w:p>
+    <w:p>
+      <w:pPr>
+        <w:numPr>
+          <w:ilvl w:val="0"/>
+          <w:numId w:val="1"/>
+        </w:numPr>
+      </w:pPr>
+      <w:r>
+        <w:t xml:space="preserve">"I really do not have time to sit an filter through internet" (I3, on finding recipes)</w:t>
+      </w:r>
+    </w:p>
+    <w:p>
+      <w:pPr>
+        <w:numPr>
+          <w:ilvl w:val="0"/>
+          <w:numId w:val="1"/>
+        </w:numPr>
+      </w:pPr>
+      <w:r>
+        <w:t xml:space="preserve">"I just decide by the day… if I have the energy to cook or not." (I18)</w:t>
+      </w:r>
+    </w:p>
+    <w:p>
+      <w:pPr>
+        <w:numPr>
+          <w:ilvl w:val="0"/>
+          <w:numId w:val="1"/>
+        </w:numPr>
+      </w:pPr>
+      <w:r>
+        <w:t xml:space="preserve">"I was too tired to go to grocery store or cook." (I6)</w:t>
+      </w:r>
+    </w:p>
+    <w:p>
+      <w:r>
+        <w:t xml:space="preserve">I16 describes exactly the chain HushPlate is built to break: no energy to plan, so no plan, so takeout. Fast food wins because it takes no thought: "It takes 20 minutes to get fast food. For grocery store, it takes 45 minutes to 2 hours." (I3). Fast food comes out ahead because deciding, planning and shopping take so long. HushPlate does those steps for the user.</w:t>
+      </w:r>
+    </w:p>
+    <w:p>
+      <w:pPr>
+        <w:pBdr>
+          <w:bottom w:val="single" w:sz="6" w:space="6" w:color="C9CCD1"/>
+        </w:pBdr>
+      </w:pPr>
+    </w:p>
+    <w:p>
+      <w:pPr>
+        <w:pStyle w:val="Heading1"/>
+      </w:pPr>
+      <w:r>
+        <w:t xml:space="preserve">Argument 2: When people plan, it works. The problem is that planning is a chore.</w:t>
+      </w:r>
+    </w:p>
+    <w:p>
+      <w:r>
+        <w:t xml:space="preserve">The interviews show a clear pattern: </w:t>
+      </w:r>
+      <w:r>
+        <w:rPr>
+          <w:b/>
+        </w:rPr>
+        <w:t xml:space="preserve">the people who plan ahead are the ones who stay on track.</w:t>
+      </w:r>
+    </w:p>
+    <w:tbl>
+      <w:tblPr>
+        <w:tblW w:w="10080" w:type="dxa"/>
+        <w:tblBorders>
+          <w:top w:val="single" w:sz="4" w:space="0" w:color="C9CCD1"/>
+          <w:left w:val="single" w:sz="4" w:space="0" w:color="C9CCD1"/>
+          <w:bottom w:val="single" w:sz="4" w:space="0" w:color="C9CCD1"/>
+          <w:right w:val="single" w:sz="4" w:space="0" w:color="C9CCD1"/>
+          <w:insideH w:val="single" w:sz="4" w:space="0" w:color="C9CCD1"/>
+          <w:insideV w:val="single" w:sz="4" w:space="0" w:color="C9CCD1"/>
+        </w:tblBorders>
+        <w:tblLayout w:type="fixed"/>
+      </w:tblPr>
+      <w:tblGrid>
+        <w:gridCol w:w="3360"/>
+        <w:gridCol w:w="3360"/>
+        <w:gridCol w:w="3360"/>
+      </w:tblGrid>
+      <w:tr>
+        <w:trPr>
+          <w:tblHeader/>
+        </w:trPr>
+        <w:tc>
+          <w:tcPr>
+            <w:tcW w:w="3360" w:type="dxa"/>
+            <w:shd w:val="clear" w:color="auto" w:fill="EFF1F3"/>
+          </w:tcPr>
+          <w:p>
+            <w:pPr>
+              <w:spacing w:before="40" w:after="40"/>
+            </w:pPr>
+            <w:r>
+              <w:rPr>
+                <w:b/>
+                <w:sz w:val="18"/>
+              </w:rPr>
+              <w:t xml:space="preserve">ID</w:t>
+            </w:r>
+          </w:p>
+        </w:tc>
+        <w:tc>
+          <w:tcPr>
+            <w:tcW w:w="3360" w:type="dxa"/>
+            <w:shd w:val="clear" w:color="auto" w:fill="EFF1F3"/>
+          </w:tcPr>
+          <w:p>
+            <w:pPr>
+              <w:spacing w:before="40" w:after="40"/>
+            </w:pPr>
+            <w:r>
+              <w:rPr>
+                <w:b/>
+                <w:sz w:val="18"/>
+              </w:rPr>
+              <w:t xml:space="preserve">When they plan</w:t>
+            </w:r>
+          </w:p>
+        </w:tc>
+        <w:tc>
+          <w:tcPr>
+            <w:tcW w:w="3360" w:type="dxa"/>
+            <w:shd w:val="clear" w:color="auto" w:fill="EFF1F3"/>
+          </w:tcPr>
+          <w:p>
+            <w:pPr>
+              <w:spacing w:before="40" w:after="40"/>
+            </w:pPr>
+            <w:r>
+              <w:rPr>
+                <w:b/>
+                <w:sz w:val="18"/>
+              </w:rPr>
+              <w:t xml:space="preserve">What happens</w:t>
+            </w:r>
+          </w:p>
+        </w:tc>
+      </w:tr>
+      <w:tr>
+        <w:tc>
+          <w:tcPr>
+            <w:tcW w:w="3360" w:type="dxa"/>
+          </w:tcPr>
+          <w:p>
+            <w:pPr>
+              <w:spacing w:before="40" w:after="40"/>
+            </w:pPr>
+            <w:r>
+              <w:rPr>
+                <w:sz w:val="18"/>
+              </w:rPr>
+              <w:t xml:space="preserve">I17</w:t>
+            </w:r>
+          </w:p>
+        </w:tc>
+        <w:tc>
+          <w:tcPr>
+            <w:tcW w:w="3360" w:type="dxa"/>
+          </w:tcPr>
+          <w:p>
+            <w:pPr>
+              <w:spacing w:before="40" w:after="40"/>
+            </w:pPr>
+            <w:r>
+              <w:rPr>
+                <w:sz w:val="18"/>
+              </w:rPr>
+              <w:t xml:space="preserve">"I created a menu and grocery list, then went grocery shopping on Sunday"</w:t>
+            </w:r>
+          </w:p>
+        </w:tc>
+        <w:tc>
+          <w:tcPr>
+            <w:tcW w:w="3360" w:type="dxa"/>
+          </w:tcPr>
+          <w:p>
+            <w:pPr>
+              <w:spacing w:before="40" w:after="40"/>
+            </w:pPr>
+            <w:r>
+              <w:rPr>
+                <w:sz w:val="18"/>
+              </w:rPr>
+              <w:t xml:space="preserve">"It went smooth, only took 20 minutes." "It was all eaten." Happy with their weight.</w:t>
+            </w:r>
+          </w:p>
+        </w:tc>
+      </w:tr>
+      <w:tr>
+        <w:tc>
+          <w:tcPr>
+            <w:tcW w:w="3360" w:type="dxa"/>
+          </w:tcPr>
+          <w:p>
+            <w:pPr>
+              <w:spacing w:before="40" w:after="40"/>
+            </w:pPr>
+            <w:r>
+              <w:rPr>
+                <w:sz w:val="18"/>
+              </w:rPr>
+              <w:t xml:space="preserve">I12</w:t>
+            </w:r>
+          </w:p>
+        </w:tc>
+        <w:tc>
+          <w:tcPr>
+            <w:tcW w:w="3360" w:type="dxa"/>
+          </w:tcPr>
+          <w:p>
+            <w:pPr>
+              <w:spacing w:before="40" w:after="40"/>
+            </w:pPr>
+            <w:r>
+              <w:rPr>
+                <w:sz w:val="18"/>
+              </w:rPr>
+              <w:t xml:space="preserve">"Typically create a meal plan for dinner so we can buy groceries for the pay period."</w:t>
+            </w:r>
+          </w:p>
+        </w:tc>
+        <w:tc>
+          <w:tcPr>
+            <w:tcW w:w="3360" w:type="dxa"/>
+          </w:tcPr>
+          <w:p>
+            <w:pPr>
+              <w:spacing w:before="40" w:after="40"/>
+            </w:pPr>
+            <w:r>
+              <w:rPr>
+                <w:sz w:val="18"/>
+              </w:rPr>
+              <w:t xml:space="preserve">"It saves time and money because I know my expected cost"</w:t>
+            </w:r>
+          </w:p>
+        </w:tc>
+      </w:tr>
+      <w:tr>
+        <w:tc>
+          <w:tcPr>
+            <w:tcW w:w="3360" w:type="dxa"/>
+          </w:tcPr>
+          <w:p>
+            <w:pPr>
+              <w:spacing w:before="40" w:after="40"/>
+            </w:pPr>
+            <w:r>
+              <w:rPr>
+                <w:sz w:val="18"/>
+              </w:rPr>
+              <w:t xml:space="preserve">I7</w:t>
+            </w:r>
+          </w:p>
+        </w:tc>
+        <w:tc>
+          <w:tcPr>
+            <w:tcW w:w="3360" w:type="dxa"/>
+          </w:tcPr>
+          <w:p>
+            <w:pPr>
+              <w:spacing w:before="40" w:after="40"/>
+            </w:pPr>
+            <w:r>
+              <w:rPr>
+                <w:sz w:val="18"/>
+              </w:rPr>
+              <w:t xml:space="preserve">"I planned what I was going to eat. I went to Sams and bought groceries and cooked."</w:t>
+            </w:r>
+          </w:p>
+        </w:tc>
+        <w:tc>
+          <w:tcPr>
+            <w:tcW w:w="3360" w:type="dxa"/>
+          </w:tcPr>
+          <w:p>
+            <w:pPr>
+              <w:spacing w:before="40" w:after="40"/>
+            </w:pPr>
+            <w:r>
+              <w:rPr>
+                <w:sz w:val="18"/>
+              </w:rPr>
+              <w:t xml:space="preserve">"I lost around 10 lbs. in a few weeks."</w:t>
+            </w:r>
+          </w:p>
+        </w:tc>
+      </w:tr>
+      <w:tr>
+        <w:tc>
+          <w:tcPr>
+            <w:tcW w:w="3360" w:type="dxa"/>
+          </w:tcPr>
+          <w:p>
+            <w:pPr>
+              <w:spacing w:before="40" w:after="40"/>
+            </w:pPr>
+            <w:r>
+              <w:rPr>
+                <w:sz w:val="18"/>
+              </w:rPr>
+              <w:t xml:space="preserve">I4</w:t>
+            </w:r>
+          </w:p>
+        </w:tc>
+        <w:tc>
+          <w:tcPr>
+            <w:tcW w:w="3360" w:type="dxa"/>
+          </w:tcPr>
+          <w:p>
+            <w:pPr>
+              <w:spacing w:before="40" w:after="40"/>
+            </w:pPr>
+            <w:r>
+              <w:rPr>
+                <w:sz w:val="18"/>
+              </w:rPr>
+              <w:t xml:space="preserve">"Grocery store happens when we sit down and plan it."</w:t>
+            </w:r>
+          </w:p>
+        </w:tc>
+        <w:tc>
+          <w:tcPr>
+            <w:tcW w:w="3360" w:type="dxa"/>
+          </w:tcPr>
+          <w:p>
+            <w:pPr>
+              <w:spacing w:before="40" w:after="40"/>
+            </w:pPr>
+            <w:r>
+              <w:rPr>
+                <w:sz w:val="18"/>
+              </w:rPr>
+              <w:t xml:space="preserve">Cooking at home "Makes me feel a lot better after eating meals."</w:t>
+            </w:r>
+          </w:p>
+        </w:tc>
+      </w:tr>
+      <w:tr>
+        <w:tc>
+          <w:tcPr>
+            <w:tcW w:w="3360" w:type="dxa"/>
+          </w:tcPr>
+          <w:p>
+            <w:pPr>
+              <w:spacing w:before="40" w:after="40"/>
+            </w:pPr>
+            <w:r>
+              <w:rPr>
+                <w:sz w:val="18"/>
+              </w:rPr>
+              <w:t xml:space="preserve">I16</w:t>
+            </w:r>
+          </w:p>
+        </w:tc>
+        <w:tc>
+          <w:tcPr>
+            <w:tcW w:w="3360" w:type="dxa"/>
+          </w:tcPr>
+          <w:p>
+            <w:pPr>
+              <w:spacing w:before="40" w:after="40"/>
+            </w:pPr>
+            <w:r>
+              <w:rPr>
+                <w:sz w:val="18"/>
+              </w:rPr>
+              <w:t xml:space="preserve">"The meals that were planned I was able to eat at work."</w:t>
+            </w:r>
+          </w:p>
+        </w:tc>
+        <w:tc>
+          <w:tcPr>
+            <w:tcW w:w="3360" w:type="dxa"/>
+          </w:tcPr>
+          <w:p>
+            <w:pPr>
+              <w:spacing w:before="40" w:after="40"/>
+            </w:pPr>
+            <w:r>
+              <w:rPr>
+                <w:sz w:val="18"/>
+              </w:rPr>
+              <w:t xml:space="preserve">Takeout came on the days with no plan.</w:t>
+            </w:r>
+          </w:p>
+        </w:tc>
+      </w:tr>
+    </w:tbl>
+    <w:p>
+      <w:pPr>
+        <w:spacing w:after="0"/>
+      </w:pPr>
+    </w:p>
+    <w:p>
+      <w:r>
+        <w:t xml:space="preserve">The people who *don't* plan say they would do better if they did:</w:t>
+      </w:r>
+    </w:p>
+    <w:p>
+      <w:pPr>
+        <w:numPr>
+          <w:ilvl w:val="0"/>
+          <w:numId w:val="1"/>
+        </w:numPr>
+      </w:pPr>
+      <w:r>
+        <w:t xml:space="preserve">"I feel like if I made meal plan then I would stick to it better… If I had a way to do if for me it would be easier." (I1)</w:t>
+      </w:r>
+    </w:p>
+    <w:p>
+      <w:pPr>
+        <w:numPr>
+          <w:ilvl w:val="0"/>
+          <w:numId w:val="1"/>
+        </w:numPr>
+      </w:pPr>
+      <w:r>
+        <w:t xml:space="preserve">"We do good in spurts 3 or to 4 days. Weekends we go back to eating out." (I4)</w:t>
+      </w:r>
+    </w:p>
+    <w:p>
+      <w:r>
+        <w:rPr>
+          <w:b/>
+        </w:rPr>
+        <w:t xml:space="preserve">Why this matters:</w:t>
+      </w:r>
+      <w:r>
+        <w:t xml:space="preserve"> the case against reads "I have a plan but I do not stick to it" as proof that planning doesn't help. A closer reading of I1 says something else: "I have a plan but I do not stick to it… Sometimes I do. Why do you not do it regular? I am not disciplined. </w:t>
+      </w:r>
+      <w:r>
+        <w:rPr>
+          <w:b/>
+        </w:rPr>
+        <w:t xml:space="preserve">If I had a way to do if for me it would be easier.</w:t>
+      </w:r>
+      <w:r>
+        <w:t xml:space="preserve">" The discipline I1 says they lack is the discipline to *make the plan* every week. That's the step HushPlate automates.</w:t>
+      </w:r>
+    </w:p>
+    <w:p>
+      <w:pPr>
+        <w:pBdr>
+          <w:bottom w:val="single" w:sz="6" w:space="6" w:color="C9CCD1"/>
+        </w:pBdr>
+      </w:pPr>
+    </w:p>
+    <w:p>
+      <w:pPr>
+        <w:pStyle w:val="Heading1"/>
+      </w:pPr>
+      <w:r>
+        <w:t xml:space="preserve">Argument 3: The juggling is real, just not with the apps we expected</w:t>
+      </w:r>
+    </w:p>
+    <w:p>
+      <w:r>
+        <w:t xml:space="preserve">The landing page says "a tracker, a recipe app, and a grocery app." The interviews show the same scattered work, spread across social media, people's heads and paper:</w:t>
+      </w:r>
+    </w:p>
+    <w:p>
+      <w:r>
+        <w:rPr>
+          <w:b/>
+        </w:rPr>
+        <w:t xml:space="preserve">Recipes come from several places:</w:t>
+      </w:r>
+    </w:p>
+    <w:p>
+      <w:pPr>
+        <w:numPr>
+          <w:ilvl w:val="0"/>
+          <w:numId w:val="1"/>
+        </w:numPr>
+      </w:pPr>
+      <w:r>
+        <w:t xml:space="preserve">"Found meal on TikTok. Look for easy meals or kid friendly meals by using TikTok, Instagram, or Google Search" (I3), and before that the Osta recipe subscription.</w:t>
+      </w:r>
+    </w:p>
+    <w:p>
+      <w:pPr>
+        <w:numPr>
+          <w:ilvl w:val="0"/>
+          <w:numId w:val="1"/>
+        </w:numPr>
+      </w:pPr>
+      <w:r>
+        <w:t xml:space="preserve">"Decided to eat that based on TikTok recipe, and Google Recipe, and AI Recipe (ChatGPT), and then go get the food." (I4). That's three sources, then a trip to the store.</w:t>
+      </w:r>
+    </w:p>
+    <w:p>
+      <w:pPr>
+        <w:numPr>
+          <w:ilvl w:val="0"/>
+          <w:numId w:val="1"/>
+        </w:numPr>
+      </w:pPr>
+      <w:r>
+        <w:t xml:space="preserve">A weekly menu "mixed in with new recipes I found on pinterest." (I17)</w:t>
+      </w:r>
+    </w:p>
+    <w:p>
+      <w:r>
+        <w:rPr>
+          <w:b/>
+        </w:rPr>
+        <w:t xml:space="preserve">Targets are tracked in people's heads:</w:t>
+      </w:r>
+    </w:p>
+    <w:p>
+      <w:pPr>
+        <w:numPr>
+          <w:ilvl w:val="0"/>
+          <w:numId w:val="1"/>
+        </w:numPr>
+      </w:pPr>
+      <w:r>
+        <w:t xml:space="preserve">"I generally track my protein intake… using a rough mental tally rather than an app." (I20)</w:t>
+      </w:r>
+    </w:p>
+    <w:p>
+      <w:pPr>
+        <w:numPr>
+          <w:ilvl w:val="0"/>
+          <w:numId w:val="1"/>
+        </w:numPr>
+      </w:pPr>
+      <w:r>
+        <w:t xml:space="preserve">"Yes, in my head." (I5)</w:t>
+      </w:r>
+    </w:p>
+    <w:p>
+      <w:pPr>
+        <w:numPr>
+          <w:ilvl w:val="0"/>
+          <w:numId w:val="1"/>
+        </w:numPr>
+      </w:pPr>
+      <w:r>
+        <w:t xml:space="preserve">"Its all in mind." (I7)</w:t>
+      </w:r>
+    </w:p>
+    <w:p>
+      <w:pPr>
+        <w:numPr>
+          <w:ilvl w:val="0"/>
+          <w:numId w:val="1"/>
+        </w:numPr>
+      </w:pPr>
+      <w:r>
+        <w:t xml:space="preserve">"Keep everything from a mental mind perspective." (I10)</w:t>
+      </w:r>
+    </w:p>
+    <w:p>
+      <w:r>
+        <w:rPr>
+          <w:b/>
+        </w:rPr>
+        <w:t xml:space="preserve">Lists and menus are kept on paper or in a notes app:</w:t>
+      </w:r>
+    </w:p>
+    <w:p>
+      <w:pPr>
+        <w:numPr>
+          <w:ilvl w:val="0"/>
+          <w:numId w:val="1"/>
+        </w:numPr>
+      </w:pPr>
+      <w:r>
+        <w:t xml:space="preserve">"When I plan a meal on grocery list, I write down on piece of paper." (I3)</w:t>
+      </w:r>
+    </w:p>
+    <w:p>
+      <w:pPr>
+        <w:numPr>
+          <w:ilvl w:val="0"/>
+          <w:numId w:val="1"/>
+        </w:numPr>
+      </w:pPr>
+      <w:r>
+        <w:t xml:space="preserve">"I have a section on my notes where I keep the menu for the week and a grocery list, it gets updated weekly." (I17)</w:t>
+      </w:r>
+    </w:p>
+    <w:p>
+      <w:pPr>
+        <w:numPr>
+          <w:ilvl w:val="0"/>
+          <w:numId w:val="1"/>
+        </w:numPr>
+      </w:pPr>
+      <w:r>
+        <w:t xml:space="preserve">"We write down list. We go to Walmart or Sams." (I2)</w:t>
+      </w:r>
+    </w:p>
+    <w:p>
+      <w:r>
+        <w:rPr>
+          <w:b/>
+        </w:rPr>
+        <w:t xml:space="preserve">The store step is done by hand too:</w:t>
+      </w:r>
+      <w:r>
+        <w:t xml:space="preserve"> "I kept on adding what I needed for 3 days… and did a pick up order." (I7)</w:t>
+      </w:r>
+    </w:p>
+    <w:p>
+      <w:r>
+        <w:t xml:space="preserve">People don't use a tracking app, but they haven't stopped tracking. They do it in their heads because the apps were too much work: "Finding an app is overwhelming" (I2), "I don't want to pay for all the added features" (I14). HushPlate doesn't ask anyone to log meals. The targets are built into the plan, so the user does no tracking at all.</w:t>
+      </w:r>
+    </w:p>
+    <w:p>
+      <w:pPr>
+        <w:pBdr>
+          <w:bottom w:val="single" w:sz="6" w:space="6" w:color="C9CCD1"/>
+        </w:pBdr>
+      </w:pPr>
+    </w:p>
+    <w:p>
+      <w:pPr>
+        <w:pStyle w:val="Heading1"/>
+      </w:pPr>
+      <w:r>
+        <w:t xml:space="preserve">Argument 4: People care about nutrition targets and hit them by hand</w:t>
+      </w:r>
+    </w:p>
+    <w:p>
+      <w:r>
+        <w:t xml:space="preserve">8 of 20 manage specific targets when they choose meals:</w:t>
+      </w:r>
+    </w:p>
+    <w:p>
+      <w:pPr>
+        <w:numPr>
+          <w:ilvl w:val="0"/>
+          <w:numId w:val="1"/>
+        </w:numPr>
+      </w:pPr>
+      <w:r>
+        <w:t xml:space="preserve">"I need to eat more protein" (I1, who is on a GLP-1)</w:t>
+      </w:r>
+    </w:p>
+    <w:p>
+      <w:pPr>
+        <w:numPr>
+          <w:ilvl w:val="0"/>
+          <w:numId w:val="1"/>
+        </w:numPr>
+      </w:pPr>
+      <w:r>
+        <w:t xml:space="preserve">"I look to see if I really ate what I am supposed based on my macros. I was looking to see if what I planned on eating fit in my macros." (I1, Q23). This is word for word the job of "Recipes that already fit."</w:t>
+      </w:r>
+    </w:p>
+    <w:p>
+      <w:pPr>
+        <w:numPr>
+          <w:ilvl w:val="0"/>
+          <w:numId w:val="1"/>
+        </w:numPr>
+      </w:pPr>
+      <w:r>
+        <w:t xml:space="preserve">"I have seen a dietitian to help me, what calories I need to maintain, and keep muscle mass." (I2)</w:t>
+      </w:r>
+    </w:p>
+    <w:p>
+      <w:pPr>
+        <w:numPr>
+          <w:ilvl w:val="0"/>
+          <w:numId w:val="1"/>
+        </w:numPr>
+      </w:pPr>
+      <w:r>
+        <w:t xml:space="preserve">"I round out the rest to meet my protein goals." (I20)</w:t>
+      </w:r>
+    </w:p>
+    <w:p>
+      <w:pPr>
+        <w:numPr>
+          <w:ilvl w:val="0"/>
+          <w:numId w:val="1"/>
+        </w:numPr>
+      </w:pPr>
+      <w:r>
+        <w:t xml:space="preserve">"Fresh veggies I made today to reach my daily vegetable and fiber goals." (I17)</w:t>
+      </w:r>
+    </w:p>
+    <w:p>
+      <w:pPr>
+        <w:numPr>
+          <w:ilvl w:val="0"/>
+          <w:numId w:val="1"/>
+        </w:numPr>
+      </w:pPr>
+      <w:r>
+        <w:t xml:space="preserve">"It contains a decent amount of protein that my body desperately needs." (I16)</w:t>
+      </w:r>
+    </w:p>
+    <w:p>
+      <w:pPr>
+        <w:numPr>
+          <w:ilvl w:val="0"/>
+          <w:numId w:val="1"/>
+        </w:numPr>
+      </w:pPr>
+      <w:r>
+        <w:t xml:space="preserve">"One friend encouraged me to use AI to implement meals to ensure I am getting enough nutrients." (I10)</w:t>
+      </w:r>
+    </w:p>
+    <w:p>
+      <w:pPr>
+        <w:numPr>
+          <w:ilvl w:val="0"/>
+          <w:numId w:val="1"/>
+        </w:numPr>
+      </w:pPr>
+      <w:r>
+        <w:t xml:space="preserve">"Focusing on calorie eating and deficient." (I12)</w:t>
+      </w:r>
+    </w:p>
+    <w:p>
+      <w:pPr>
+        <w:numPr>
+          <w:ilvl w:val="0"/>
+          <w:numId w:val="1"/>
+        </w:numPr>
+      </w:pPr>
+      <w:r>
+        <w:t xml:space="preserve">MyFitnessPal "like a breakdown of the micronutrients" (I14). They wanted it, just not at that price.</w:t>
+      </w:r>
+    </w:p>
+    <w:p>
+      <w:r>
+        <w:rPr>
+          <w:b/>
+        </w:rPr>
+        <w:t xml:space="preserve">On GLP-1s:</w:t>
+      </w:r>
+      <w:r>
+        <w:t xml:space="preserve"> I1 is on one, says "You just do not eat as much," and still names protein as their first problem. When people eat less, each meal has to carry more protein. That supports the landing page's "protein-first portions" line.</w:t>
+      </w:r>
+    </w:p>
+    <w:p>
+      <w:r>
+        <w:rPr>
+          <w:b/>
+        </w:rPr>
+        <w:t xml:space="preserve">Restrictions and allergies came up without being asked.</w:t>
+      </w:r>
+      <w:r>
+        <w:t xml:space="preserve"> In Q28, four people said we should have asked about dietary restrictions, intolerances or allergies: I13, I15, I16, and I20 ("I am vegetarian"). HushPlate's profile already includes "allergies, and food dislikes."</w:t>
+      </w:r>
+    </w:p>
+    <w:p>
+      <w:pPr>
+        <w:pBdr>
+          <w:bottom w:val="single" w:sz="6" w:space="6" w:color="C9CCD1"/>
+        </w:pBdr>
+      </w:pPr>
+    </w:p>
+    <w:p>
+      <w:pPr>
+        <w:pStyle w:val="Heading1"/>
+      </w:pPr>
+      <w:r>
+        <w:t xml:space="preserve">Argument 5: People already order groceries digitally, especially when short on time</w:t>
+      </w:r>
+    </w:p>
+    <w:p>
+      <w:r>
+        <w:t xml:space="preserve">6 of 20 already use a digital channel to get groceries:</w:t>
+      </w:r>
+    </w:p>
+    <w:tbl>
+      <w:tblPr>
+        <w:tblW w:w="10080" w:type="dxa"/>
+        <w:tblBorders>
+          <w:top w:val="single" w:sz="4" w:space="0" w:color="C9CCD1"/>
+          <w:left w:val="single" w:sz="4" w:space="0" w:color="C9CCD1"/>
+          <w:bottom w:val="single" w:sz="4" w:space="0" w:color="C9CCD1"/>
+          <w:right w:val="single" w:sz="4" w:space="0" w:color="C9CCD1"/>
+          <w:insideH w:val="single" w:sz="4" w:space="0" w:color="C9CCD1"/>
+          <w:insideV w:val="single" w:sz="4" w:space="0" w:color="C9CCD1"/>
+        </w:tblBorders>
+        <w:tblLayout w:type="fixed"/>
+      </w:tblPr>
+      <w:tblGrid>
+        <w:gridCol w:w="3360"/>
+        <w:gridCol w:w="3360"/>
+        <w:gridCol w:w="3360"/>
+      </w:tblGrid>
+      <w:tr>
+        <w:trPr>
+          <w:tblHeader/>
+        </w:trPr>
+        <w:tc>
+          <w:tcPr>
+            <w:tcW w:w="3360" w:type="dxa"/>
+            <w:shd w:val="clear" w:color="auto" w:fill="EFF1F3"/>
+          </w:tcPr>
+          <w:p>
+            <w:pPr>
+              <w:spacing w:before="40" w:after="40"/>
+            </w:pPr>
+            <w:r>
+              <w:rPr>
+                <w:b/>
+                <w:sz w:val="18"/>
+              </w:rPr>
+              <w:t xml:space="preserve">ID</w:t>
+            </w:r>
+          </w:p>
+        </w:tc>
+        <w:tc>
+          <w:tcPr>
+            <w:tcW w:w="3360" w:type="dxa"/>
+            <w:shd w:val="clear" w:color="auto" w:fill="EFF1F3"/>
+          </w:tcPr>
+          <w:p>
+            <w:pPr>
+              <w:spacing w:before="40" w:after="40"/>
+            </w:pPr>
+            <w:r>
+              <w:rPr>
+                <w:b/>
+                <w:sz w:val="18"/>
+              </w:rPr>
+              <w:t xml:space="preserve">What they do</w:t>
+            </w:r>
+          </w:p>
+        </w:tc>
+        <w:tc>
+          <w:tcPr>
+            <w:tcW w:w="3360" w:type="dxa"/>
+            <w:shd w:val="clear" w:color="auto" w:fill="EFF1F3"/>
+          </w:tcPr>
+          <w:p>
+            <w:pPr>
+              <w:spacing w:before="40" w:after="40"/>
+            </w:pPr>
+            <w:r>
+              <w:rPr>
+                <w:b/>
+                <w:sz w:val="18"/>
+              </w:rPr>
+              <w:t xml:space="preserve">When</w:t>
+            </w:r>
+          </w:p>
+        </w:tc>
+      </w:tr>
+      <w:tr>
+        <w:tc>
+          <w:tcPr>
+            <w:tcW w:w="3360" w:type="dxa"/>
+          </w:tcPr>
+          <w:p>
+            <w:pPr>
+              <w:spacing w:before="40" w:after="40"/>
+            </w:pPr>
+            <w:r>
+              <w:rPr>
+                <w:sz w:val="18"/>
+              </w:rPr>
+              <w:t xml:space="preserve">I7</w:t>
+            </w:r>
+          </w:p>
+        </w:tc>
+        <w:tc>
+          <w:tcPr>
+            <w:tcW w:w="3360" w:type="dxa"/>
+          </w:tcPr>
+          <w:p>
+            <w:pPr>
+              <w:spacing w:before="40" w:after="40"/>
+            </w:pPr>
+            <w:r>
+              <w:rPr>
+                <w:sz w:val="18"/>
+              </w:rPr>
+              <w:t xml:space="preserve">Builds a list in the Sam's app over 3 days, then places a pickup order. Also adds items in the Tom Thumb app after an email.</w:t>
+            </w:r>
+          </w:p>
+        </w:tc>
+        <w:tc>
+          <w:tcPr>
+            <w:tcW w:w="3360" w:type="dxa"/>
+          </w:tcPr>
+          <w:p>
+            <w:pPr>
+              <w:spacing w:before="40" w:after="40"/>
+            </w:pPr>
+            <w:r>
+              <w:rPr>
+                <w:sz w:val="18"/>
+              </w:rPr>
+              <w:t xml:space="preserve">Weekly</w:t>
+            </w:r>
+          </w:p>
+        </w:tc>
+      </w:tr>
+      <w:tr>
+        <w:tc>
+          <w:tcPr>
+            <w:tcW w:w="3360" w:type="dxa"/>
+          </w:tcPr>
+          <w:p>
+            <w:pPr>
+              <w:spacing w:before="40" w:after="40"/>
+            </w:pPr>
+            <w:r>
+              <w:rPr>
+                <w:sz w:val="18"/>
+              </w:rPr>
+              <w:t xml:space="preserve">I3</w:t>
+            </w:r>
+          </w:p>
+        </w:tc>
+        <w:tc>
+          <w:tcPr>
+            <w:tcW w:w="3360" w:type="dxa"/>
+          </w:tcPr>
+          <w:p>
+            <w:pPr>
+              <w:spacing w:before="40" w:after="40"/>
+            </w:pPr>
+            <w:r>
+              <w:rPr>
+                <w:sz w:val="18"/>
+              </w:rPr>
+              <w:t xml:space="preserve">Curbside pickup</w:t>
+            </w:r>
+          </w:p>
+        </w:tc>
+        <w:tc>
+          <w:tcPr>
+            <w:tcW w:w="3360" w:type="dxa"/>
+          </w:tcPr>
+          <w:p>
+            <w:pPr>
+              <w:spacing w:before="40" w:after="40"/>
+            </w:pPr>
+            <w:r>
+              <w:rPr>
+                <w:sz w:val="18"/>
+              </w:rPr>
+              <w:t xml:space="preserve">"If late, then do curbside after work."</w:t>
+            </w:r>
+          </w:p>
+        </w:tc>
+      </w:tr>
+      <w:tr>
+        <w:tc>
+          <w:tcPr>
+            <w:tcW w:w="3360" w:type="dxa"/>
+          </w:tcPr>
+          <w:p>
+            <w:pPr>
+              <w:spacing w:before="40" w:after="40"/>
+            </w:pPr>
+            <w:r>
+              <w:rPr>
+                <w:sz w:val="18"/>
+              </w:rPr>
+              <w:t xml:space="preserve">I4</w:t>
+            </w:r>
+          </w:p>
+        </w:tc>
+        <w:tc>
+          <w:tcPr>
+            <w:tcW w:w="3360" w:type="dxa"/>
+          </w:tcPr>
+          <w:p>
+            <w:pPr>
+              <w:spacing w:before="40" w:after="40"/>
+            </w:pPr>
+            <w:r>
+              <w:rPr>
+                <w:sz w:val="18"/>
+              </w:rPr>
+              <w:t xml:space="preserve">Curbside pickup</w:t>
+            </w:r>
+          </w:p>
+        </w:tc>
+        <w:tc>
+          <w:tcPr>
+            <w:tcW w:w="3360" w:type="dxa"/>
+          </w:tcPr>
+          <w:p>
+            <w:pPr>
+              <w:spacing w:before="40" w:after="40"/>
+            </w:pPr>
+            <w:r>
+              <w:rPr>
+                <w:sz w:val="18"/>
+              </w:rPr>
+              <w:t xml:space="preserve">"If we are running tight on time" (about 10% of trips)</w:t>
+            </w:r>
+          </w:p>
+        </w:tc>
+      </w:tr>
+      <w:tr>
+        <w:tc>
+          <w:tcPr>
+            <w:tcW w:w="3360" w:type="dxa"/>
+          </w:tcPr>
+          <w:p>
+            <w:pPr>
+              <w:spacing w:before="40" w:after="40"/>
+            </w:pPr>
+            <w:r>
+              <w:rPr>
+                <w:sz w:val="18"/>
+              </w:rPr>
+              <w:t xml:space="preserve">I9</w:t>
+            </w:r>
+          </w:p>
+        </w:tc>
+        <w:tc>
+          <w:tcPr>
+            <w:tcW w:w="3360" w:type="dxa"/>
+          </w:tcPr>
+          <w:p>
+            <w:pPr>
+              <w:spacing w:before="40" w:after="40"/>
+            </w:pPr>
+            <w:r>
+              <w:rPr>
+                <w:sz w:val="18"/>
+              </w:rPr>
+              <w:t xml:space="preserve">Orders online</w:t>
+            </w:r>
+          </w:p>
+        </w:tc>
+        <w:tc>
+          <w:tcPr>
+            <w:tcW w:w="3360" w:type="dxa"/>
+          </w:tcPr>
+          <w:p>
+            <w:pPr>
+              <w:spacing w:before="40" w:after="40"/>
+            </w:pPr>
+            <w:r>
+              <w:rPr>
+                <w:sz w:val="18"/>
+              </w:rPr>
+              <w:t xml:space="preserve">"I shop online for some cereal for kids."</w:t>
+            </w:r>
+          </w:p>
+        </w:tc>
+      </w:tr>
+      <w:tr>
+        <w:tc>
+          <w:tcPr>
+            <w:tcW w:w="3360" w:type="dxa"/>
+          </w:tcPr>
+          <w:p>
+            <w:pPr>
+              <w:spacing w:before="40" w:after="40"/>
+            </w:pPr>
+            <w:r>
+              <w:rPr>
+                <w:sz w:val="18"/>
+              </w:rPr>
+              <w:t xml:space="preserve">I10</w:t>
+            </w:r>
+          </w:p>
+        </w:tc>
+        <w:tc>
+          <w:tcPr>
+            <w:tcW w:w="3360" w:type="dxa"/>
+          </w:tcPr>
+          <w:p>
+            <w:pPr>
+              <w:spacing w:before="40" w:after="40"/>
+            </w:pPr>
+            <w:r>
+              <w:rPr>
+                <w:sz w:val="18"/>
+              </w:rPr>
+              <w:t xml:space="preserve">Online butcher, shipped to the house</w:t>
+            </w:r>
+          </w:p>
+        </w:tc>
+        <w:tc>
+          <w:tcPr>
+            <w:tcW w:w="3360" w:type="dxa"/>
+          </w:tcPr>
+          <w:p>
+            <w:pPr>
+              <w:spacing w:before="40" w:after="40"/>
+            </w:pPr>
+            <w:r>
+              <w:rPr>
+                <w:sz w:val="18"/>
+              </w:rPr>
+              <w:t xml:space="preserve">Monthly bulk order</w:t>
+            </w:r>
+          </w:p>
+        </w:tc>
+      </w:tr>
+      <w:tr>
+        <w:tc>
+          <w:tcPr>
+            <w:tcW w:w="3360" w:type="dxa"/>
+          </w:tcPr>
+          <w:p>
+            <w:pPr>
+              <w:spacing w:before="40" w:after="40"/>
+            </w:pPr>
+            <w:r>
+              <w:rPr>
+                <w:sz w:val="18"/>
+              </w:rPr>
+              <w:t xml:space="preserve">I12</w:t>
+            </w:r>
+          </w:p>
+        </w:tc>
+        <w:tc>
+          <w:tcPr>
+            <w:tcW w:w="3360" w:type="dxa"/>
+          </w:tcPr>
+          <w:p>
+            <w:pPr>
+              <w:spacing w:before="40" w:after="40"/>
+            </w:pPr>
+            <w:r>
+              <w:rPr>
+                <w:sz w:val="18"/>
+              </w:rPr>
+              <w:t xml:space="preserve">Grocery store app</w:t>
+            </w:r>
+          </w:p>
+        </w:tc>
+        <w:tc>
+          <w:tcPr>
+            <w:tcW w:w="3360" w:type="dxa"/>
+          </w:tcPr>
+          <w:p>
+            <w:pPr>
+              <w:spacing w:before="40" w:after="40"/>
+            </w:pPr>
+            <w:r>
+              <w:rPr>
+                <w:sz w:val="18"/>
+              </w:rPr>
+              <w:t xml:space="preserve">"To easily navigate the store aisle"</w:t>
+            </w:r>
+          </w:p>
+        </w:tc>
+      </w:tr>
+    </w:tbl>
+    <w:p>
+      <w:pPr>
+        <w:spacing w:after="0"/>
+      </w:pPr>
+    </w:p>
+    <w:p>
+      <w:r>
+        <w:t xml:space="preserve">Two things stand out:</w:t>
+      </w:r>
+    </w:p>
+    <w:p>
+      <w:pPr>
+        <w:numPr>
+          <w:ilvl w:val="0"/>
+          <w:numId w:val="1"/>
+        </w:numPr>
+      </w:pPr>
+      <w:r>
+        <w:rPr>
+          <w:b/>
+        </w:rPr>
+        <w:t xml:space="preserve">I7 already does by hand what the agent would do:</w:t>
+      </w:r>
+      <w:r>
+        <w:t xml:space="preserve"> building a list across several days in the store's app, then placing a pickup order.</w:t>
+      </w:r>
+    </w:p>
+    <w:p>
+      <w:pPr>
+        <w:numPr>
+          <w:ilvl w:val="0"/>
+          <w:numId w:val="1"/>
+        </w:numPr>
+      </w:pPr>
+      <w:r>
+        <w:rPr>
+          <w:b/>
+        </w:rPr>
+        <w:t xml:space="preserve">Curbside comes out on time-pressed days</w:t>
+      </w:r>
+      <w:r>
+        <w:t xml:space="preserve"> (I3, I4), which are the same days the top pain hits.</w:t>
+      </w:r>
+    </w:p>
+    <w:p>
+      <w:r>
+        <w:t xml:space="preserve">I4's complaint about curbside is about substitutions: "they substitute items that they do not have, or give you something completely different." HushPlate's "You review it and approve before anything is bought" step speaks directly to that.</w:t>
+      </w:r>
+    </w:p>
+    <w:p>
+      <w:r>
+        <w:rPr>
+          <w:b/>
+        </w:rPr>
+        <w:t xml:space="preserve">Shopping trips cost real time:</w:t>
+      </w:r>
+    </w:p>
+    <w:tbl>
+      <w:tblPr>
+        <w:tblW w:w="10080" w:type="dxa"/>
+        <w:tblBorders>
+          <w:top w:val="single" w:sz="4" w:space="0" w:color="C9CCD1"/>
+          <w:left w:val="single" w:sz="4" w:space="0" w:color="C9CCD1"/>
+          <w:bottom w:val="single" w:sz="4" w:space="0" w:color="C9CCD1"/>
+          <w:right w:val="single" w:sz="4" w:space="0" w:color="C9CCD1"/>
+          <w:insideH w:val="single" w:sz="4" w:space="0" w:color="C9CCD1"/>
+          <w:insideV w:val="single" w:sz="4" w:space="0" w:color="C9CCD1"/>
+        </w:tblBorders>
+        <w:tblLayout w:type="fixed"/>
+      </w:tblPr>
+      <w:tblGrid>
+        <w:gridCol w:w="5040"/>
+        <w:gridCol w:w="5040"/>
+      </w:tblGrid>
+      <w:tr>
+        <w:trPr>
+          <w:tblHeader/>
+        </w:trPr>
+        <w:tc>
+          <w:tcPr>
+            <w:tcW w:w="5040" w:type="dxa"/>
+            <w:shd w:val="clear" w:color="auto" w:fill="EFF1F3"/>
+          </w:tcPr>
+          <w:p>
+            <w:pPr>
+              <w:spacing w:before="40" w:after="40"/>
+            </w:pPr>
+            <w:r>
+              <w:rPr>
+                <w:b/>
+                <w:sz w:val="18"/>
+              </w:rPr>
+              <w:t xml:space="preserve">ID</w:t>
+            </w:r>
+          </w:p>
+        </w:tc>
+        <w:tc>
+          <w:tcPr>
+            <w:tcW w:w="5040" w:type="dxa"/>
+            <w:shd w:val="clear" w:color="auto" w:fill="EFF1F3"/>
+          </w:tcPr>
+          <w:p>
+            <w:pPr>
+              <w:spacing w:before="40" w:after="40"/>
+            </w:pPr>
+            <w:r>
+              <w:rPr>
+                <w:b/>
+                <w:sz w:val="18"/>
+              </w:rPr>
+              <w:t xml:space="preserve">Time per trip</w:t>
+            </w:r>
+          </w:p>
+        </w:tc>
+      </w:tr>
+      <w:tr>
+        <w:tc>
+          <w:tcPr>
+            <w:tcW w:w="5040" w:type="dxa"/>
+          </w:tcPr>
+          <w:p>
+            <w:pPr>
+              <w:spacing w:before="40" w:after="40"/>
+            </w:pPr>
+            <w:r>
+              <w:rPr>
+                <w:sz w:val="18"/>
+              </w:rPr>
+              <w:t xml:space="preserve">I1</w:t>
+            </w:r>
+          </w:p>
+        </w:tc>
+        <w:tc>
+          <w:tcPr>
+            <w:tcW w:w="5040" w:type="dxa"/>
+          </w:tcPr>
+          <w:p>
+            <w:pPr>
+              <w:spacing w:before="40" w:after="40"/>
+            </w:pPr>
+            <w:r>
+              <w:rPr>
+                <w:sz w:val="18"/>
+              </w:rPr>
+              <w:t xml:space="preserve">About 2 hours, plus "10 minutes to make a list"</w:t>
+            </w:r>
+          </w:p>
+        </w:tc>
+      </w:tr>
+      <w:tr>
+        <w:tc>
+          <w:tcPr>
+            <w:tcW w:w="5040" w:type="dxa"/>
+          </w:tcPr>
+          <w:p>
+            <w:pPr>
+              <w:spacing w:before="40" w:after="40"/>
+            </w:pPr>
+            <w:r>
+              <w:rPr>
+                <w:sz w:val="18"/>
+              </w:rPr>
+              <w:t xml:space="preserve">I2</w:t>
+            </w:r>
+          </w:p>
+        </w:tc>
+        <w:tc>
+          <w:tcPr>
+            <w:tcW w:w="5040" w:type="dxa"/>
+          </w:tcPr>
+          <w:p>
+            <w:pPr>
+              <w:spacing w:before="40" w:after="40"/>
+            </w:pPr>
+            <w:r>
+              <w:rPr>
+                <w:sz w:val="18"/>
+              </w:rPr>
+              <w:t xml:space="preserve">About 2 hours</w:t>
+            </w:r>
+          </w:p>
+        </w:tc>
+      </w:tr>
+      <w:tr>
+        <w:tc>
+          <w:tcPr>
+            <w:tcW w:w="5040" w:type="dxa"/>
+          </w:tcPr>
+          <w:p>
+            <w:pPr>
+              <w:spacing w:before="40" w:after="40"/>
+            </w:pPr>
+            <w:r>
+              <w:rPr>
+                <w:sz w:val="18"/>
+              </w:rPr>
+              <w:t xml:space="preserve">I3</w:t>
+            </w:r>
+          </w:p>
+        </w:tc>
+        <w:tc>
+          <w:tcPr>
+            <w:tcW w:w="5040" w:type="dxa"/>
+          </w:tcPr>
+          <w:p>
+            <w:pPr>
+              <w:spacing w:before="40" w:after="40"/>
+            </w:pPr>
+            <w:r>
+              <w:rPr>
+                <w:sz w:val="18"/>
+              </w:rPr>
+              <w:t xml:space="preserve">45 minutes to 2 hours</w:t>
+            </w:r>
+          </w:p>
+        </w:tc>
+      </w:tr>
+      <w:tr>
+        <w:tc>
+          <w:tcPr>
+            <w:tcW w:w="5040" w:type="dxa"/>
+          </w:tcPr>
+          <w:p>
+            <w:pPr>
+              <w:spacing w:before="40" w:after="40"/>
+            </w:pPr>
+            <w:r>
+              <w:rPr>
+                <w:sz w:val="18"/>
+              </w:rPr>
+              <w:t xml:space="preserve">I4</w:t>
+            </w:r>
+          </w:p>
+        </w:tc>
+        <w:tc>
+          <w:tcPr>
+            <w:tcW w:w="5040" w:type="dxa"/>
+          </w:tcPr>
+          <w:p>
+            <w:pPr>
+              <w:spacing w:before="40" w:after="40"/>
+            </w:pPr>
+            <w:r>
+              <w:rPr>
+                <w:sz w:val="18"/>
+              </w:rPr>
+              <w:t xml:space="preserve">1.5 to 2 hours</w:t>
+            </w:r>
+          </w:p>
+        </w:tc>
+      </w:tr>
+      <w:tr>
+        <w:tc>
+          <w:tcPr>
+            <w:tcW w:w="5040" w:type="dxa"/>
+          </w:tcPr>
+          <w:p>
+            <w:pPr>
+              <w:spacing w:before="40" w:after="40"/>
+            </w:pPr>
+            <w:r>
+              <w:rPr>
+                <w:sz w:val="18"/>
+              </w:rPr>
+              <w:t xml:space="preserve">I5</w:t>
+            </w:r>
+          </w:p>
+        </w:tc>
+        <w:tc>
+          <w:tcPr>
+            <w:tcW w:w="5040" w:type="dxa"/>
+          </w:tcPr>
+          <w:p>
+            <w:pPr>
+              <w:spacing w:before="40" w:after="40"/>
+            </w:pPr>
+            <w:r>
+              <w:rPr>
+                <w:sz w:val="18"/>
+              </w:rPr>
+              <w:t xml:space="preserve">45 minutes to 1 hour</w:t>
+            </w:r>
+          </w:p>
+        </w:tc>
+      </w:tr>
+      <w:tr>
+        <w:tc>
+          <w:tcPr>
+            <w:tcW w:w="5040" w:type="dxa"/>
+          </w:tcPr>
+          <w:p>
+            <w:pPr>
+              <w:spacing w:before="40" w:after="40"/>
+            </w:pPr>
+            <w:r>
+              <w:rPr>
+                <w:sz w:val="18"/>
+              </w:rPr>
+              <w:t xml:space="preserve">I6</w:t>
+            </w:r>
+          </w:p>
+        </w:tc>
+        <w:tc>
+          <w:tcPr>
+            <w:tcW w:w="5040" w:type="dxa"/>
+          </w:tcPr>
+          <w:p>
+            <w:pPr>
+              <w:spacing w:before="40" w:after="40"/>
+            </w:pPr>
+            <w:r>
+              <w:rPr>
+                <w:sz w:val="18"/>
+              </w:rPr>
+              <w:t xml:space="preserve">1 hour</w:t>
+            </w:r>
+          </w:p>
+        </w:tc>
+      </w:tr>
+      <w:tr>
+        <w:tc>
+          <w:tcPr>
+            <w:tcW w:w="5040" w:type="dxa"/>
+          </w:tcPr>
+          <w:p>
+            <w:pPr>
+              <w:spacing w:before="40" w:after="40"/>
+            </w:pPr>
+            <w:r>
+              <w:rPr>
+                <w:sz w:val="18"/>
+              </w:rPr>
+              <w:t xml:space="preserve">I7</w:t>
+            </w:r>
+          </w:p>
+        </w:tc>
+        <w:tc>
+          <w:tcPr>
+            <w:tcW w:w="5040" w:type="dxa"/>
+          </w:tcPr>
+          <w:p>
+            <w:pPr>
+              <w:spacing w:before="40" w:after="40"/>
+            </w:pPr>
+            <w:r>
+              <w:rPr>
+                <w:sz w:val="18"/>
+              </w:rPr>
+              <w:t xml:space="preserve">1.5 to 2 hours, plus 15 minutes a day for 3 days of list-building</w:t>
+            </w:r>
+          </w:p>
+        </w:tc>
+      </w:tr>
+      <w:tr>
+        <w:tc>
+          <w:tcPr>
+            <w:tcW w:w="5040" w:type="dxa"/>
+          </w:tcPr>
+          <w:p>
+            <w:pPr>
+              <w:spacing w:before="40" w:after="40"/>
+            </w:pPr>
+            <w:r>
+              <w:rPr>
+                <w:sz w:val="18"/>
+              </w:rPr>
+              <w:t xml:space="preserve">I14</w:t>
+            </w:r>
+          </w:p>
+        </w:tc>
+        <w:tc>
+          <w:tcPr>
+            <w:tcW w:w="5040" w:type="dxa"/>
+          </w:tcPr>
+          <w:p>
+            <w:pPr>
+              <w:spacing w:before="40" w:after="40"/>
+            </w:pPr>
+            <w:r>
+              <w:rPr>
+                <w:sz w:val="18"/>
+              </w:rPr>
+              <w:t xml:space="preserve">About 2 hours across two stores</w:t>
+            </w:r>
+          </w:p>
+        </w:tc>
+      </w:tr>
+    </w:tbl>
+    <w:p>
+      <w:pPr>
+        <w:spacing w:after="0"/>
+      </w:pPr>
+    </w:p>
+    <w:p>
+      <w:r>
+        <w:t xml:space="preserve">For people shopping weekly, that adds up to roughly 50–100 hours a year. Only I3 called the trip a pain, but the time is spent either way.</w:t>
+      </w:r>
+    </w:p>
+    <w:p>
+      <w:pPr>
+        <w:pBdr>
+          <w:bottom w:val="single" w:sz="6" w:space="6" w:color="C9CCD1"/>
+        </w:pBdr>
+      </w:pPr>
+    </w:p>
+    <w:p>
+      <w:pPr>
+        <w:pStyle w:val="Heading1"/>
+      </w:pPr>
+      <w:r>
+        <w:t xml:space="preserve">Argument 6: People are asking for it to be done for them, and some already use AI</w:t>
+      </w:r>
+    </w:p>
+    <w:p>
+      <w:pPr>
+        <w:numPr>
+          <w:ilvl w:val="0"/>
+          <w:numId w:val="1"/>
+        </w:numPr>
+      </w:pPr>
+      <w:r>
+        <w:t xml:space="preserve">"If I had a way to do if for me it would be easier." (I1)</w:t>
+      </w:r>
+    </w:p>
+    <w:p>
+      <w:pPr>
+        <w:numPr>
+          <w:ilvl w:val="0"/>
+          <w:numId w:val="1"/>
+        </w:numPr>
+      </w:pPr>
+      <w:r>
+        <w:t xml:space="preserve">"I mentioned to a friend about an app that could take a picture of plate and do journaling for me." (I13). I13 had gone looking for automation.</w:t>
+      </w:r>
+    </w:p>
+    <w:p>
+      <w:pPr>
+        <w:numPr>
+          <w:ilvl w:val="0"/>
+          <w:numId w:val="1"/>
+        </w:numPr>
+      </w:pPr>
+      <w:r>
+        <w:t xml:space="preserve">"AI Recipe (ChatGPT)" (I4). They already use AI to decide meals.</w:t>
+      </w:r>
+    </w:p>
+    <w:p>
+      <w:pPr>
+        <w:numPr>
+          <w:ilvl w:val="0"/>
+          <w:numId w:val="1"/>
+        </w:numPr>
+      </w:pPr>
+      <w:r>
+        <w:t xml:space="preserve">"One friend encouraged me to use AI to implement meals to ensure I am getting enough nutrients." (I10)</w:t>
+      </w:r>
+    </w:p>
+    <w:p>
+      <w:pPr>
+        <w:numPr>
+          <w:ilvl w:val="0"/>
+          <w:numId w:val="1"/>
+        </w:numPr>
+      </w:pPr>
+      <w:r>
+        <w:t xml:space="preserve">"When I was on weightwatchers, I tracked it." (I1). They followed through when a structured program existed.</w:t>
+      </w:r>
+    </w:p>
+    <w:p>
+      <w:pPr>
+        <w:numPr>
+          <w:ilvl w:val="0"/>
+          <w:numId w:val="1"/>
+        </w:numPr>
+      </w:pPr>
+      <w:r>
+        <w:t xml:space="preserve">The challenge diet worked until "the challenge ended and I was no longer being held accountable." (I14). Structure from outside works for this person; HushPlate gives it to them every week.</w:t>
+      </w:r>
+    </w:p>
+    <w:p>
+      <w:r>
+        <w:t xml:space="preserve">No one in the interviews objected to AI. The four people who brought it up treated it as a normal tool.</w:t>
+      </w:r>
+    </w:p>
+    <w:p>
+      <w:pPr>
+        <w:pBdr>
+          <w:bottom w:val="single" w:sz="6" w:space="6" w:color="C9CCD1"/>
+        </w:pBdr>
+      </w:pPr>
+    </w:p>
+    <w:p>
+      <w:pPr>
+        <w:pStyle w:val="Heading1"/>
+      </w:pPr>
+      <w:r>
+        <w:t xml:space="preserve">Argument 7: Money is already being spent on this problem</w:t>
+      </w:r>
+    </w:p>
+    <w:p>
+      <w:r>
+        <w:t xml:space="preserve">8 of 20 have spent money on losing weight or making eating easier:</w:t>
+      </w:r>
+    </w:p>
+    <w:tbl>
+      <w:tblPr>
+        <w:tblW w:w="10080" w:type="dxa"/>
+        <w:tblBorders>
+          <w:top w:val="single" w:sz="4" w:space="0" w:color="C9CCD1"/>
+          <w:left w:val="single" w:sz="4" w:space="0" w:color="C9CCD1"/>
+          <w:bottom w:val="single" w:sz="4" w:space="0" w:color="C9CCD1"/>
+          <w:right w:val="single" w:sz="4" w:space="0" w:color="C9CCD1"/>
+          <w:insideH w:val="single" w:sz="4" w:space="0" w:color="C9CCD1"/>
+          <w:insideV w:val="single" w:sz="4" w:space="0" w:color="C9CCD1"/>
+        </w:tblBorders>
+        <w:tblLayout w:type="fixed"/>
+      </w:tblPr>
+      <w:tblGrid>
+        <w:gridCol w:w="5040"/>
+        <w:gridCol w:w="5040"/>
+      </w:tblGrid>
+      <w:tr>
+        <w:trPr>
+          <w:tblHeader/>
+        </w:trPr>
+        <w:tc>
+          <w:tcPr>
+            <w:tcW w:w="5040" w:type="dxa"/>
+            <w:shd w:val="clear" w:color="auto" w:fill="EFF1F3"/>
+          </w:tcPr>
+          <w:p>
+            <w:pPr>
+              <w:spacing w:before="40" w:after="40"/>
+            </w:pPr>
+            <w:r>
+              <w:rPr>
+                <w:b/>
+                <w:sz w:val="18"/>
+              </w:rPr>
+              <w:t xml:space="preserve">What</w:t>
+            </w:r>
+          </w:p>
+        </w:tc>
+        <w:tc>
+          <w:tcPr>
+            <w:tcW w:w="5040" w:type="dxa"/>
+            <w:shd w:val="clear" w:color="auto" w:fill="EFF1F3"/>
+          </w:tcPr>
+          <w:p>
+            <w:pPr>
+              <w:spacing w:before="40" w:after="40"/>
+            </w:pPr>
+            <w:r>
+              <w:rPr>
+                <w:b/>
+                <w:sz w:val="18"/>
+              </w:rPr>
+              <w:t xml:space="preserve">Interviews</w:t>
+            </w:r>
+          </w:p>
+        </w:tc>
+      </w:tr>
+      <w:tr>
+        <w:tc>
+          <w:tcPr>
+            <w:tcW w:w="5040" w:type="dxa"/>
+          </w:tcPr>
+          <w:p>
+            <w:pPr>
+              <w:spacing w:before="40" w:after="40"/>
+            </w:pPr>
+            <w:r>
+              <w:rPr>
+                <w:sz w:val="18"/>
+              </w:rPr>
+              <w:t xml:space="preserve">GLP-1 or weight-loss medication</w:t>
+            </w:r>
+          </w:p>
+        </w:tc>
+        <w:tc>
+          <w:tcPr>
+            <w:tcW w:w="5040" w:type="dxa"/>
+          </w:tcPr>
+          <w:p>
+            <w:pPr>
+              <w:spacing w:before="40" w:after="40"/>
+            </w:pPr>
+            <w:r>
+              <w:rPr>
+                <w:sz w:val="18"/>
+              </w:rPr>
+              <w:t xml:space="preserve">I1, I9 (current); I13, I19 (past)</w:t>
+            </w:r>
+          </w:p>
+        </w:tc>
+      </w:tr>
+      <w:tr>
+        <w:tc>
+          <w:tcPr>
+            <w:tcW w:w="5040" w:type="dxa"/>
+          </w:tcPr>
+          <w:p>
+            <w:pPr>
+              <w:spacing w:before="40" w:after="40"/>
+            </w:pPr>
+            <w:r>
+              <w:rPr>
+                <w:sz w:val="18"/>
+              </w:rPr>
+              <w:t xml:space="preserve">Dietitian or nutritionist</w:t>
+            </w:r>
+          </w:p>
+        </w:tc>
+        <w:tc>
+          <w:tcPr>
+            <w:tcW w:w="5040" w:type="dxa"/>
+          </w:tcPr>
+          <w:p>
+            <w:pPr>
+              <w:spacing w:before="40" w:after="40"/>
+            </w:pPr>
+            <w:r>
+              <w:rPr>
+                <w:sz w:val="18"/>
+              </w:rPr>
+              <w:t xml:space="preserve">I1, I2 (through work), I19</w:t>
+            </w:r>
+          </w:p>
+        </w:tc>
+      </w:tr>
+      <w:tr>
+        <w:tc>
+          <w:tcPr>
+            <w:tcW w:w="5040" w:type="dxa"/>
+          </w:tcPr>
+          <w:p>
+            <w:pPr>
+              <w:spacing w:before="40" w:after="40"/>
+            </w:pPr>
+            <w:r>
+              <w:rPr>
+                <w:sz w:val="18"/>
+              </w:rPr>
+              <w:t xml:space="preserve">Weight Watchers (past)</w:t>
+            </w:r>
+          </w:p>
+        </w:tc>
+        <w:tc>
+          <w:tcPr>
+            <w:tcW w:w="5040" w:type="dxa"/>
+          </w:tcPr>
+          <w:p>
+            <w:pPr>
+              <w:spacing w:before="40" w:after="40"/>
+            </w:pPr>
+            <w:r>
+              <w:rPr>
+                <w:sz w:val="18"/>
+              </w:rPr>
+              <w:t xml:space="preserve">I1</w:t>
+            </w:r>
+          </w:p>
+        </w:tc>
+      </w:tr>
+      <w:tr>
+        <w:tc>
+          <w:tcPr>
+            <w:tcW w:w="5040" w:type="dxa"/>
+          </w:tcPr>
+          <w:p>
+            <w:pPr>
+              <w:spacing w:before="40" w:after="40"/>
+            </w:pPr>
+            <w:r>
+              <w:rPr>
+                <w:sz w:val="18"/>
+              </w:rPr>
+              <w:t xml:space="preserve">Osta recipe subscription, $3/month</w:t>
+            </w:r>
+          </w:p>
+        </w:tc>
+        <w:tc>
+          <w:tcPr>
+            <w:tcW w:w="5040" w:type="dxa"/>
+          </w:tcPr>
+          <w:p>
+            <w:pPr>
+              <w:spacing w:before="40" w:after="40"/>
+            </w:pPr>
+            <w:r>
+              <w:rPr>
+                <w:sz w:val="18"/>
+              </w:rPr>
+              <w:t xml:space="preserve">I3</w:t>
+            </w:r>
+          </w:p>
+        </w:tc>
+      </w:tr>
+      <w:tr>
+        <w:tc>
+          <w:tcPr>
+            <w:tcW w:w="5040" w:type="dxa"/>
+          </w:tcPr>
+          <w:p>
+            <w:pPr>
+              <w:spacing w:before="40" w:after="40"/>
+            </w:pPr>
+            <w:r>
+              <w:rPr>
+                <w:sz w:val="18"/>
+              </w:rPr>
+              <w:t xml:space="preserve">Fitbit</w:t>
+            </w:r>
+          </w:p>
+        </w:tc>
+        <w:tc>
+          <w:tcPr>
+            <w:tcW w:w="5040" w:type="dxa"/>
+          </w:tcPr>
+          <w:p>
+            <w:pPr>
+              <w:spacing w:before="40" w:after="40"/>
+            </w:pPr>
+            <w:r>
+              <w:rPr>
+                <w:sz w:val="18"/>
+              </w:rPr>
+              <w:t xml:space="preserve">I7</w:t>
+            </w:r>
+          </w:p>
+        </w:tc>
+      </w:tr>
+      <w:tr>
+        <w:tc>
+          <w:tcPr>
+            <w:tcW w:w="5040" w:type="dxa"/>
+          </w:tcPr>
+          <w:p>
+            <w:pPr>
+              <w:spacing w:before="40" w:after="40"/>
+            </w:pPr>
+            <w:r>
+              <w:rPr>
+                <w:sz w:val="18"/>
+              </w:rPr>
+              <w:t xml:space="preserve">Premade, pre-marinated, pre-seasoned or frozen food, paid for to save effort</w:t>
+            </w:r>
+          </w:p>
+        </w:tc>
+        <w:tc>
+          <w:tcPr>
+            <w:tcW w:w="5040" w:type="dxa"/>
+          </w:tcPr>
+          <w:p>
+            <w:pPr>
+              <w:spacing w:before="40" w:after="40"/>
+            </w:pPr>
+            <w:r>
+              <w:rPr>
+                <w:sz w:val="18"/>
+              </w:rPr>
+              <w:t xml:space="preserve">I7, I8, I13, I19</w:t>
+            </w:r>
+          </w:p>
+        </w:tc>
+      </w:tr>
+    </w:tbl>
+    <w:p>
+      <w:pPr>
+        <w:spacing w:after="0"/>
+      </w:pPr>
+    </w:p>
+    <w:p>
+      <w:pPr>
+        <w:numPr>
+          <w:ilvl w:val="0"/>
+          <w:numId w:val="1"/>
+        </w:numPr>
+      </w:pPr>
+      <w:r>
+        <w:t xml:space="preserve">"I mostly get premade stuff so it's easier to make, I also buy thinks that are pre-marinated so it's easier to cook." (I19). This person already pays extra to save effort.</w:t>
+      </w:r>
+    </w:p>
+    <w:p>
+      <w:pPr>
+        <w:numPr>
+          <w:ilvl w:val="0"/>
+          <w:numId w:val="1"/>
+        </w:numPr>
+      </w:pPr>
+      <w:r>
+        <w:t xml:space="preserve">"I am willing to pay for an app." (I2). It's a stated preference, so it's weak on its own, but it came from someone who already pays a dietitian through work and gets InBody scans.</w:t>
+      </w:r>
+    </w:p>
+    <w:p>
+      <w:pPr>
+        <w:numPr>
+          <w:ilvl w:val="0"/>
+          <w:numId w:val="1"/>
+        </w:numPr>
+      </w:pPr>
+      <w:r>
+        <w:t xml:space="preserve">The Osta and Weight Watchers cancellations were about </w:t>
+      </w:r>
+      <w:r>
+        <w:rPr>
+          <w:b/>
+        </w:rPr>
+        <w:t xml:space="preserve">not using them</w:t>
+      </w:r>
+      <w:r>
+        <w:t xml:space="preserve">, not about price: "I did not use it as often I thought it would." (I3). A product that builds the weekly grocery order gets used every week, because people have to get food anyway.</w:t>
+      </w:r>
+    </w:p>
+    <w:p>
+      <w:pPr>
+        <w:pBdr>
+          <w:bottom w:val="single" w:sz="6" w:space="6" w:color="C9CCD1"/>
+        </w:pBdr>
+      </w:pPr>
+    </w:p>
+    <w:p>
+      <w:pPr>
+        <w:pStyle w:val="Heading1"/>
+      </w:pPr>
+      <w:r>
+        <w:t xml:space="preserve">Argument 8: Households are a bigger market, not a reason to stop</w:t>
+      </w:r>
+    </w:p>
+    <w:p>
+      <w:r>
+        <w:t xml:space="preserve">The case against reads "someone else shops" as a dead end. The interviews point the other way:</w:t>
+      </w:r>
+    </w:p>
+    <w:p>
+      <w:pPr>
+        <w:numPr>
+          <w:ilvl w:val="0"/>
+          <w:numId w:val="1"/>
+        </w:numPr>
+      </w:pPr>
+      <w:r>
+        <w:rPr>
+          <w:b/>
+        </w:rPr>
+        <w:t xml:space="preserve">Some interviewees plan for a whole household:</w:t>
+      </w:r>
+      <w:r>
+        <w:t xml:space="preserve"> "I usually ask my family members and then decide what to cook." (I14). "Usually, I cook based on what they enjoy eating." (I10). "I cook for family members." (I1)</w:t>
+      </w:r>
+    </w:p>
+    <w:p>
+      <w:pPr>
+        <w:numPr>
+          <w:ilvl w:val="0"/>
+          <w:numId w:val="1"/>
+        </w:numPr>
+      </w:pPr>
+      <w:r>
+        <w:rPr>
+          <w:b/>
+        </w:rPr>
+        <w:t xml:space="preserve">Some are spouses or parents who shop for a dieter:</w:t>
+      </w:r>
+      <w:r>
+        <w:t xml:space="preserve"> "My wife decides what I will eat. She cooks for me." (I9). "Wife cooks for me." (I2). "My mom prepares some of my meals." (I20)</w:t>
+      </w:r>
+    </w:p>
+    <w:p>
+      <w:pPr>
+        <w:numPr>
+          <w:ilvl w:val="0"/>
+          <w:numId w:val="1"/>
+        </w:numPr>
+      </w:pPr>
+      <w:r>
+        <w:rPr>
+          <w:b/>
+        </w:rPr>
+        <w:t xml:space="preserve">These people already plan for a group:</w:t>
+      </w:r>
+      <w:r>
+        <w:t xml:space="preserve"> "Each dinner is based or decided on what we plan as a team." (I12, fire crew). "Make baby food first, baby has healthy food, and we eat bad food." (I4)</w:t>
+      </w:r>
+    </w:p>
+    <w:p>
+      <w:r>
+        <w:t xml:space="preserve">I4's quote shows the gap clearly: the household already plans for one member's needs (the baby's) and not for the adult who is trying to lose weight. A plan that holds one person's targets inside a family menu fills that gap. And the wives and mothers above are customers too, because they are the ones who buy the food.</w:t>
+      </w:r>
+    </w:p>
+    <w:p>
+      <w:pPr>
+        <w:pBdr>
+          <w:bottom w:val="single" w:sz="6" w:space="6" w:color="C9CCD1"/>
+        </w:pBdr>
+      </w:pPr>
+    </w:p>
+    <w:p>
+      <w:pPr>
+        <w:pStyle w:val="Heading1"/>
+      </w:pPr>
+      <w:r>
+        <w:t xml:space="preserve">Answering the case against</w:t>
+      </w:r>
+    </w:p>
+    <w:p>
+      <w:r>
+        <w:rPr>
+          <w:b/>
+        </w:rPr>
+        <w:t xml:space="preserve">"HushPlate would have prevented only 1 of 19 failure days."</w:t>
+      </w:r>
+      <w:r>
+        <w:t xml:space="preserve"> That test only counted the moment things went wrong, not the step before it. A closer reading of those stories:</w:t>
+      </w:r>
+    </w:p>
+    <w:tbl>
+      <w:tblPr>
+        <w:tblW w:w="10080" w:type="dxa"/>
+        <w:tblBorders>
+          <w:top w:val="single" w:sz="4" w:space="0" w:color="C9CCD1"/>
+          <w:left w:val="single" w:sz="4" w:space="0" w:color="C9CCD1"/>
+          <w:bottom w:val="single" w:sz="4" w:space="0" w:color="C9CCD1"/>
+          <w:right w:val="single" w:sz="4" w:space="0" w:color="C9CCD1"/>
+          <w:insideH w:val="single" w:sz="4" w:space="0" w:color="C9CCD1"/>
+          <w:insideV w:val="single" w:sz="4" w:space="0" w:color="C9CCD1"/>
+        </w:tblBorders>
+        <w:tblLayout w:type="fixed"/>
+      </w:tblPr>
+      <w:tblGrid>
+        <w:gridCol w:w="3360"/>
+        <w:gridCol w:w="3360"/>
+        <w:gridCol w:w="3360"/>
+      </w:tblGrid>
+      <w:tr>
+        <w:trPr>
+          <w:tblHeader/>
+        </w:trPr>
+        <w:tc>
+          <w:tcPr>
+            <w:tcW w:w="3360" w:type="dxa"/>
+            <w:shd w:val="clear" w:color="auto" w:fill="EFF1F3"/>
+          </w:tcPr>
+          <w:p>
+            <w:pPr>
+              <w:spacing w:before="40" w:after="40"/>
+            </w:pPr>
+            <w:r>
+              <w:rPr>
+                <w:b/>
+                <w:sz w:val="18"/>
+              </w:rPr>
+              <w:t xml:space="preserve">ID</w:t>
+            </w:r>
+          </w:p>
+        </w:tc>
+        <w:tc>
+          <w:tcPr>
+            <w:tcW w:w="3360" w:type="dxa"/>
+            <w:shd w:val="clear" w:color="auto" w:fill="EFF1F3"/>
+          </w:tcPr>
+          <w:p>
+            <w:pPr>
+              <w:spacing w:before="40" w:after="40"/>
+            </w:pPr>
+            <w:r>
+              <w:rPr>
+                <w:b/>
+                <w:sz w:val="18"/>
+              </w:rPr>
+              <w:t xml:space="preserve">Failure</w:t>
+            </w:r>
+          </w:p>
+        </w:tc>
+        <w:tc>
+          <w:tcPr>
+            <w:tcW w:w="3360" w:type="dxa"/>
+            <w:shd w:val="clear" w:color="auto" w:fill="EFF1F3"/>
+          </w:tcPr>
+          <w:p>
+            <w:pPr>
+              <w:spacing w:before="40" w:after="40"/>
+            </w:pPr>
+            <w:r>
+              <w:rPr>
+                <w:b/>
+                <w:sz w:val="18"/>
+              </w:rPr>
+              <w:t xml:space="preserve">What came before it</w:t>
+            </w:r>
+          </w:p>
+        </w:tc>
+      </w:tr>
+      <w:tr>
+        <w:tc>
+          <w:tcPr>
+            <w:tcW w:w="3360" w:type="dxa"/>
+          </w:tcPr>
+          <w:p>
+            <w:pPr>
+              <w:spacing w:before="40" w:after="40"/>
+            </w:pPr>
+            <w:r>
+              <w:rPr>
+                <w:sz w:val="18"/>
+              </w:rPr>
+              <w:t xml:space="preserve">I16</w:t>
+            </w:r>
+          </w:p>
+        </w:tc>
+        <w:tc>
+          <w:tcPr>
+            <w:tcW w:w="3360" w:type="dxa"/>
+          </w:tcPr>
+          <w:p>
+            <w:pPr>
+              <w:spacing w:before="40" w:after="40"/>
+            </w:pPr>
+            <w:r>
+              <w:rPr>
+                <w:sz w:val="18"/>
+              </w:rPr>
+              <w:t xml:space="preserve">Takeout</w:t>
+            </w:r>
+          </w:p>
+        </w:tc>
+        <w:tc>
+          <w:tcPr>
+            <w:tcW w:w="3360" w:type="dxa"/>
+          </w:tcPr>
+          <w:p>
+            <w:pPr>
+              <w:spacing w:before="40" w:after="40"/>
+            </w:pPr>
+            <w:r>
+              <w:rPr>
+                <w:sz w:val="18"/>
+              </w:rPr>
+              <w:t xml:space="preserve">"Not having energy to meal plan." </w:t>
+            </w:r>
+            <w:r>
+              <w:rPr>
+                <w:b/>
+                <w:sz w:val="18"/>
+              </w:rPr>
+              <w:t xml:space="preserve">Planning was the cause.</w:t>
+            </w:r>
+          </w:p>
+        </w:tc>
+      </w:tr>
+      <w:tr>
+        <w:tc>
+          <w:tcPr>
+            <w:tcW w:w="3360" w:type="dxa"/>
+          </w:tcPr>
+          <w:p>
+            <w:pPr>
+              <w:spacing w:before="40" w:after="40"/>
+            </w:pPr>
+            <w:r>
+              <w:rPr>
+                <w:sz w:val="18"/>
+              </w:rPr>
+              <w:t xml:space="preserve">I1</w:t>
+            </w:r>
+          </w:p>
+        </w:tc>
+        <w:tc>
+          <w:tcPr>
+            <w:tcW w:w="3360" w:type="dxa"/>
+          </w:tcPr>
+          <w:p>
+            <w:pPr>
+              <w:spacing w:before="40" w:after="40"/>
+            </w:pPr>
+            <w:r>
+              <w:rPr>
+                <w:sz w:val="18"/>
+              </w:rPr>
+              <w:t xml:space="preserve">Plan broke</w:t>
+            </w:r>
+          </w:p>
+        </w:tc>
+        <w:tc>
+          <w:tcPr>
+            <w:tcW w:w="3360" w:type="dxa"/>
+          </w:tcPr>
+          <w:p>
+            <w:pPr>
+              <w:spacing w:before="40" w:after="40"/>
+            </w:pPr>
+            <w:r>
+              <w:rPr>
+                <w:sz w:val="18"/>
+              </w:rPr>
+              <w:t xml:space="preserve">No ingredients for the recipe. </w:t>
+            </w:r>
+            <w:r>
+              <w:rPr>
+                <w:b/>
+                <w:sz w:val="18"/>
+              </w:rPr>
+              <w:t xml:space="preserve">Shopping was the cause.</w:t>
+            </w:r>
+          </w:p>
+        </w:tc>
+      </w:tr>
+      <w:tr>
+        <w:tc>
+          <w:tcPr>
+            <w:tcW w:w="3360" w:type="dxa"/>
+          </w:tcPr>
+          <w:p>
+            <w:pPr>
+              <w:spacing w:before="40" w:after="40"/>
+            </w:pPr>
+            <w:r>
+              <w:rPr>
+                <w:sz w:val="18"/>
+              </w:rPr>
+              <w:t xml:space="preserve">I6</w:t>
+            </w:r>
+          </w:p>
+        </w:tc>
+        <w:tc>
+          <w:tcPr>
+            <w:tcW w:w="3360" w:type="dxa"/>
+          </w:tcPr>
+          <w:p>
+            <w:pPr>
+              <w:spacing w:before="40" w:after="40"/>
+            </w:pPr>
+            <w:r>
+              <w:rPr>
+                <w:sz w:val="18"/>
+              </w:rPr>
+              <w:t xml:space="preserve">Fast food</w:t>
+            </w:r>
+          </w:p>
+        </w:tc>
+        <w:tc>
+          <w:tcPr>
+            <w:tcW w:w="3360" w:type="dxa"/>
+          </w:tcPr>
+          <w:p>
+            <w:pPr>
+              <w:spacing w:before="40" w:after="40"/>
+            </w:pPr>
+            <w:r>
+              <w:rPr>
+                <w:sz w:val="18"/>
+              </w:rPr>
+              <w:t xml:space="preserve">"Too tired to go to grocery store" </w:t>
+            </w:r>
+            <w:r>
+              <w:rPr>
+                <w:b/>
+                <w:sz w:val="18"/>
+              </w:rPr>
+              <w:t xml:space="preserve">Shopping was half the cause.</w:t>
+            </w:r>
+          </w:p>
+        </w:tc>
+      </w:tr>
+      <w:tr>
+        <w:tc>
+          <w:tcPr>
+            <w:tcW w:w="3360" w:type="dxa"/>
+          </w:tcPr>
+          <w:p>
+            <w:pPr>
+              <w:spacing w:before="40" w:after="40"/>
+            </w:pPr>
+            <w:r>
+              <w:rPr>
+                <w:sz w:val="18"/>
+              </w:rPr>
+              <w:t xml:space="preserve">I11</w:t>
+            </w:r>
+          </w:p>
+        </w:tc>
+        <w:tc>
+          <w:tcPr>
+            <w:tcW w:w="3360" w:type="dxa"/>
+          </w:tcPr>
+          <w:p>
+            <w:pPr>
+              <w:spacing w:before="40" w:after="40"/>
+            </w:pPr>
+            <w:r>
+              <w:rPr>
+                <w:sz w:val="18"/>
+              </w:rPr>
+              <w:t xml:space="preserve">Ran out of leftovers</w:t>
+            </w:r>
+          </w:p>
+        </w:tc>
+        <w:tc>
+          <w:tcPr>
+            <w:tcW w:w="3360" w:type="dxa"/>
+          </w:tcPr>
+          <w:p>
+            <w:pPr>
+              <w:spacing w:before="40" w:after="40"/>
+            </w:pPr>
+            <w:r>
+              <w:rPr>
+                <w:sz w:val="18"/>
+              </w:rPr>
+              <w:t xml:space="preserve">Cooked too little. </w:t>
+            </w:r>
+            <w:r>
+              <w:rPr>
+                <w:b/>
+                <w:sz w:val="18"/>
+              </w:rPr>
+              <w:t xml:space="preserve">Portion planning.</w:t>
+            </w:r>
+          </w:p>
+        </w:tc>
+      </w:tr>
+      <w:tr>
+        <w:tc>
+          <w:tcPr>
+            <w:tcW w:w="3360" w:type="dxa"/>
+          </w:tcPr>
+          <w:p>
+            <w:pPr>
+              <w:spacing w:before="40" w:after="40"/>
+            </w:pPr>
+            <w:r>
+              <w:rPr>
+                <w:sz w:val="18"/>
+              </w:rPr>
+              <w:t xml:space="preserve">I14</w:t>
+            </w:r>
+          </w:p>
+        </w:tc>
+        <w:tc>
+          <w:tcPr>
+            <w:tcW w:w="3360" w:type="dxa"/>
+          </w:tcPr>
+          <w:p>
+            <w:pPr>
+              <w:spacing w:before="40" w:after="40"/>
+            </w:pPr>
+            <w:r>
+              <w:rPr>
+                <w:sz w:val="18"/>
+              </w:rPr>
+              <w:t xml:space="preserve">Fast food</w:t>
+            </w:r>
+          </w:p>
+        </w:tc>
+        <w:tc>
+          <w:tcPr>
+            <w:tcW w:w="3360" w:type="dxa"/>
+          </w:tcPr>
+          <w:p>
+            <w:pPr>
+              <w:spacing w:before="40" w:after="40"/>
+            </w:pPr>
+            <w:r>
+              <w:rPr>
+                <w:sz w:val="18"/>
+              </w:rPr>
+              <w:t xml:space="preserve">Had the ingredients, but lasagna "took a couple of hours in total." </w:t>
+            </w:r>
+            <w:r>
+              <w:rPr>
+                <w:b/>
+                <w:sz w:val="18"/>
+              </w:rPr>
+              <w:t xml:space="preserve">Quick recipes that fit the plan.</w:t>
+            </w:r>
+          </w:p>
+        </w:tc>
+      </w:tr>
+      <w:tr>
+        <w:tc>
+          <w:tcPr>
+            <w:tcW w:w="3360" w:type="dxa"/>
+          </w:tcPr>
+          <w:p>
+            <w:pPr>
+              <w:spacing w:before="40" w:after="40"/>
+            </w:pPr>
+            <w:r>
+              <w:rPr>
+                <w:sz w:val="18"/>
+              </w:rPr>
+              <w:t xml:space="preserve">I19</w:t>
+            </w:r>
+          </w:p>
+        </w:tc>
+        <w:tc>
+          <w:tcPr>
+            <w:tcW w:w="3360" w:type="dxa"/>
+          </w:tcPr>
+          <w:p>
+            <w:pPr>
+              <w:spacing w:before="40" w:after="40"/>
+            </w:pPr>
+            <w:r>
+              <w:rPr>
+                <w:sz w:val="18"/>
+              </w:rPr>
+              <w:t xml:space="preserve">Didn't eat a dish</w:t>
+            </w:r>
+          </w:p>
+        </w:tc>
+        <w:tc>
+          <w:tcPr>
+            <w:tcW w:w="3360" w:type="dxa"/>
+          </w:tcPr>
+          <w:p>
+            <w:pPr>
+              <w:spacing w:before="40" w:after="40"/>
+            </w:pPr>
+            <w:r>
+              <w:rPr>
+                <w:sz w:val="18"/>
+              </w:rPr>
+              <w:t xml:space="preserve">"I have very limited cooking skills." </w:t>
+            </w:r>
+            <w:r>
+              <w:rPr>
+                <w:b/>
+                <w:sz w:val="18"/>
+              </w:rPr>
+              <w:t xml:space="preserve">Recipes matched to skill.</w:t>
+            </w:r>
+          </w:p>
+        </w:tc>
+      </w:tr>
+      <w:tr>
+        <w:tc>
+          <w:tcPr>
+            <w:tcW w:w="3360" w:type="dxa"/>
+          </w:tcPr>
+          <w:p>
+            <w:pPr>
+              <w:spacing w:before="40" w:after="40"/>
+            </w:pPr>
+            <w:r>
+              <w:rPr>
+                <w:sz w:val="18"/>
+              </w:rPr>
+              <w:t xml:space="preserve">I3</w:t>
+            </w:r>
+          </w:p>
+        </w:tc>
+        <w:tc>
+          <w:tcPr>
+            <w:tcW w:w="3360" w:type="dxa"/>
+          </w:tcPr>
+          <w:p>
+            <w:pPr>
+              <w:spacing w:before="40" w:after="40"/>
+            </w:pPr>
+            <w:r>
+              <w:rPr>
+                <w:sz w:val="18"/>
+              </w:rPr>
+              <w:t xml:space="preserve">Fast food</w:t>
+            </w:r>
+          </w:p>
+        </w:tc>
+        <w:tc>
+          <w:tcPr>
+            <w:tcW w:w="3360" w:type="dxa"/>
+          </w:tcPr>
+          <w:p>
+            <w:pPr>
+              <w:spacing w:before="40" w:after="40"/>
+            </w:pPr>
+            <w:r>
+              <w:rPr>
+                <w:sz w:val="18"/>
+              </w:rPr>
+              <w:t xml:space="preserve">"Sometimes it easier." </w:t>
+            </w:r>
+            <w:r>
+              <w:rPr>
+                <w:b/>
+                <w:sz w:val="18"/>
+              </w:rPr>
+              <w:t xml:space="preserve">A ready plan with easy meals.</w:t>
+            </w:r>
+          </w:p>
+        </w:tc>
+      </w:tr>
+    </w:tbl>
+    <w:p>
+      <w:pPr>
+        <w:spacing w:after="0"/>
+      </w:pPr>
+    </w:p>
+    <w:p>
+      <w:r>
+        <w:t xml:space="preserve">So up to 7 of 19 failure days have a planning, shopping or recipe cause that HushPlate addresses, not 1. Cravings and illness are real, and HushPlate won't fix them. It doesn't need to fix every failure, only the most common ones.</w:t>
+      </w:r>
+    </w:p>
+    <w:p>
+      <w:r>
+        <w:rPr>
+          <w:b/>
+        </w:rPr>
+        <w:t xml:space="preserve">"Nobody uses a tracker."</w:t>
+      </w:r>
+      <w:r>
+        <w:t xml:space="preserve"> That's because tracking apps are a chore, not because people don't care about targets. 8 of 20 manage targets by hand. A product that holds the targets without any logging is the gap.</w:t>
+      </w:r>
+    </w:p>
+    <w:p>
+      <w:r>
+        <w:rPr>
+          <w:b/>
+        </w:rPr>
+        <w:t xml:space="preserve">"Nobody uses delivery."</w:t>
+      </w:r>
+      <w:r>
+        <w:t xml:space="preserve"> Six people use pickup, curbside, store apps or online orders. HushPlate can produce a pickup cart and doesn't need delivery.</w:t>
+      </w:r>
+    </w:p>
+    <w:p>
+      <w:r>
+        <w:rPr>
+          <w:b/>
+        </w:rPr>
+        <w:t xml:space="preserve">"Shopping is fun for some people."</w:t>
+      </w:r>
+      <w:r>
+        <w:t xml:space="preserve"> Then they can keep shopping. A planned list still saves the 10–45 minutes of list-making, and those who enjoy the trip (I11, I13) aren't the target user. The target user is the time-pressed half of the sample.</w:t>
+      </w:r>
+    </w:p>
+    <w:p>
+      <w:r>
+        <w:rPr>
+          <w:b/>
+        </w:rPr>
+        <w:t xml:space="preserve">"Nobody pays for food apps."</w:t>
+      </w:r>
+      <w:r>
+        <w:t xml:space="preserve"> People do pay for structure and convenience: Weight Watchers, Osta, dietitians, GLP-1s and premade food. Weak engagement killed the past subscriptions, not price, and a product that does the grocery order every week gets used every week.</w:t>
+      </w:r>
+    </w:p>
+    <w:p>
+      <w:pPr>
+        <w:pStyle w:val="Heading1"/>
+      </w:pPr>
+      <w:r>
+        <w:t xml:space="preserve">The target user this evidence points to</w:t>
+      </w:r>
+    </w:p>
+    <w:p>
+      <w:r>
+        <w:t xml:space="preserve">The case for HushPlate is strongest for </w:t>
+      </w:r>
+      <w:r>
+        <w:rPr>
+          <w:b/>
+        </w:rPr>
+        <w:t xml:space="preserve">busy people who already plan when they have time and who cook for a household.</w:t>
+      </w:r>
+      <w:r>
+        <w:t xml:space="preserve"> The interviewees who fit best:</w:t>
+      </w:r>
+    </w:p>
+    <w:p>
+      <w:pPr>
+        <w:numPr>
+          <w:ilvl w:val="0"/>
+          <w:numId w:val="1"/>
+        </w:numPr>
+      </w:pPr>
+      <w:r>
+        <w:rPr>
+          <w:b/>
+        </w:rPr>
+        <w:t xml:space="preserve">I1:</w:t>
+      </w:r>
+      <w:r>
+        <w:t xml:space="preserve"> on a GLP-1, shops with a list, cooks for family, checks macros, and says "do it for me"</w:t>
+      </w:r>
+    </w:p>
+    <w:p>
+      <w:pPr>
+        <w:numPr>
+          <w:ilvl w:val="0"/>
+          <w:numId w:val="1"/>
+        </w:numPr>
+      </w:pPr>
+      <w:r>
+        <w:rPr>
+          <w:b/>
+        </w:rPr>
+        <w:t xml:space="preserve">I3:</w:t>
+      </w:r>
+      <w:r>
+        <w:t xml:space="preserve"> curbside after work, baby at home, recipes from social media</w:t>
+      </w:r>
+    </w:p>
+    <w:p>
+      <w:pPr>
+        <w:numPr>
+          <w:ilvl w:val="0"/>
+          <w:numId w:val="1"/>
+        </w:numPr>
+      </w:pPr>
+      <w:r>
+        <w:rPr>
+          <w:b/>
+        </w:rPr>
+        <w:t xml:space="preserve">I4:</w:t>
+      </w:r>
+      <w:r>
+        <w:t xml:space="preserve"> a baby at home, three recipe sources, curbside when short on time</w:t>
+      </w:r>
+    </w:p>
+    <w:p>
+      <w:pPr>
+        <w:numPr>
+          <w:ilvl w:val="0"/>
+          <w:numId w:val="1"/>
+        </w:numPr>
+      </w:pPr>
+      <w:r>
+        <w:rPr>
+          <w:b/>
+        </w:rPr>
+        <w:t xml:space="preserve">I7:</w:t>
+      </w:r>
+      <w:r>
+        <w:t xml:space="preserve"> already builds pickup orders in the store app</w:t>
+      </w:r>
+    </w:p>
+    <w:p>
+      <w:pPr>
+        <w:numPr>
+          <w:ilvl w:val="0"/>
+          <w:numId w:val="1"/>
+        </w:numPr>
+      </w:pPr>
+      <w:r>
+        <w:rPr>
+          <w:b/>
+        </w:rPr>
+        <w:t xml:space="preserve">I16:</w:t>
+      </w:r>
+      <w:r>
+        <w:t xml:space="preserve"> "not having energy to meal plan"</w:t>
+      </w:r>
+    </w:p>
+    <w:p>
+      <w:r>
+        <w:t xml:space="preserve">The best feature for the first version is building a household meal plan with each person's targets and turning it into a pickup cart.</w:t>
+      </w:r>
+    </w:p>
+    <w:p>
+      <w:pPr>
+        <w:pStyle w:val="Heading1"/>
+      </w:pPr>
+      <w:r>
+        <w:t xml:space="preserve">What would confirm this case</w:t>
+      </w:r>
+    </w:p>
+    <w:p>
+      <w:r>
+        <w:t xml:space="preserve">The case is confirmed if the next round of interviews, with people screened as dieting now and busy, shows:</w:t>
+      </w:r>
+    </w:p>
+    <w:p>
+      <w:r>
+        <w:t xml:space="preserve">1. People who can name a recent day they got takeout *because* nothing was planned.</w:t>
+      </w:r>
+    </w:p>
+    <w:p>
+      <w:r>
+        <w:t xml:space="preserve">2. People who use pickup or curbside at least sometimes, and who mention the time it takes to build the list.</w:t>
+      </w:r>
+    </w:p>
+    <w:p>
+      <w:r>
+        <w:t xml:space="preserve">3. People who already spend money to save food effort (premade food, meal kits, delivery fees) and can say roughly how much each week.</w:t>
+      </w:r>
+    </w:p>
+    <w:p>
+      <w:r>
+        <w:t xml:space="preserve">4. People who say yes to a concrete step: a 15-minute session where we build their next week's plan and cart, followed by whether they actually use it.</w:t>
+      </w:r>
+    </w:p>
+    <w:p>
+      <w:pPr>
+        <w:pStyle w:val="Heading1"/>
+      </w:pPr>
+      <w:r>
+        <w:t xml:space="preserve">Where this case is weakest</w:t>
+      </w:r>
+    </w:p>
+    <w:p>
+      <w:r>
+        <w:t xml:space="preserve">This section is an argument for the idea, but these points should be stated plainly:</w:t>
+      </w:r>
+    </w:p>
+    <w:p>
+      <w:pPr>
+        <w:numPr>
+          <w:ilvl w:val="0"/>
+          <w:numId w:val="1"/>
+        </w:numPr>
+      </w:pPr>
+      <w:r>
+        <w:rPr>
+          <w:b/>
+        </w:rPr>
+        <w:t xml:space="preserve">The paying evidence is mostly indirect.</w:t>
+      </w:r>
+      <w:r>
+        <w:t xml:space="preserve"> No one pays for a food or diet app today, and three people said outright that they won't pay for one.</w:t>
+      </w:r>
+    </w:p>
+    <w:p>
+      <w:pPr>
+        <w:numPr>
+          <w:ilvl w:val="0"/>
+          <w:numId w:val="1"/>
+        </w:numPr>
+      </w:pPr>
+      <w:r>
+        <w:rPr>
+          <w:b/>
+        </w:rPr>
+        <w:t xml:space="preserve">Some evidence was reinterpreted.</w:t>
+      </w:r>
+      <w:r>
+        <w:t xml:space="preserve"> Reclassifying failure days from 1 to 7 depends on reading what happened before each failure, and some of those readings (I3, I14, I19) are generous.</w:t>
+      </w:r>
+    </w:p>
+    <w:p>
+      <w:pPr>
+        <w:numPr>
+          <w:ilvl w:val="0"/>
+          <w:numId w:val="1"/>
+        </w:numPr>
+      </w:pPr>
+      <w:r>
+        <w:rPr>
+          <w:b/>
+        </w:rPr>
+        <w:t xml:space="preserve">The strongest fit is a short list of people.</w:t>
+      </w:r>
+      <w:r>
+        <w:t xml:space="preserve"> The "planning is the gap" pattern rests on I1, I4 and I16.</w:t>
       </w:r>
     </w:p>
     <w:sectPr>

</xml_diff>

<commit_message>
Add verdict weighing both interview-evidence cases (section 3)
Co-Authored-By: Claude Opus 5.5 <noreply@anthropic.com>
</commit_message>
<xml_diff>
--- a/07_DietGroceryApp/research/InterviewEvidenceWrong_Research.docx
+++ b/07_DietGroceryApp/research/InterviewEvidenceWrong_Research.docx
@@ -6726,6 +6726,1621 @@
       <w:r>
         <w:t xml:space="preserve"> The "planning is the gap" pattern rests on I1, I4 and I16.</w:t>
       </w:r>
+    </w:p>
+    <w:p>
+      <w:r>
+        <w:br w:type="page"/>
+      </w:r>
+    </w:p>
+    <w:p>
+      <w:pPr>
+        <w:pStyle w:val="Title"/>
+      </w:pPr>
+      <w:r>
+        <w:t xml:space="preserve">Verdict: Weighing the Case Against and the Case For</w:t>
+      </w:r>
+    </w:p>
+    <w:p>
+      <w:r>
+        <w:rPr>
+          <w:b/>
+        </w:rPr>
+        <w:t xml:space="preserve">Prepared:</w:t>
+      </w:r>
+      <w:r>
+        <w:t xml:space="preserve"> 2026-10-06 · </w:t>
+      </w:r>
+      <w:r>
+        <w:rPr>
+          <w:b/>
+        </w:rPr>
+        <w:t xml:space="preserve">Project:</w:t>
+      </w:r>
+      <w:r>
+        <w:t xml:space="preserve"> 07_DietGroceryApp (HushPlate) · </w:t>
+      </w:r>
+      <w:r>
+        <w:rPr>
+          <w:b/>
+        </w:rPr>
+        <w:t xml:space="preserve">Weighs:</w:t>
+      </w:r>
+      <w:r>
+        <w:t xml:space="preserve"> the two sections above · </w:t>
+      </w:r>
+      <w:r>
+        <w:rPr>
+          <w:b/>
+        </w:rPr>
+        <w:t xml:space="preserve">Evidence:</w:t>
+      </w:r>
+      <w:r>
+        <w:t xml:space="preserve"> the same 20 interviews (IDs I1–I20), nothing else</w:t>
+      </w:r>
+    </w:p>
+    <w:p>
+      <w:pPr>
+        <w:pStyle w:val="Heading1"/>
+      </w:pPr>
+      <w:r>
+        <w:t xml:space="preserve">The decision</w:t>
+      </w:r>
+    </w:p>
+    <w:p>
+      <w:r>
+        <w:rPr>
+          <w:b/>
+        </w:rPr>
+        <w:t xml:space="preserve">Don't build HushPlate as it's pitched today. Don't drop the problem either.</w:t>
+      </w:r>
+      <w:r>
+        <w:t xml:space="preserve"> Run one more round, aimed at a narrower group of users, with a hand-run test instead of software.</w:t>
+      </w:r>
+    </w:p>
+    <w:p>
+      <w:r>
+        <w:t xml:space="preserve">The case against wins on the product as described: a grocery-ordering agent for dieters who juggle apps. The case for wins on the problem underneath it: busy people run out of energy to plan and fall back on fast food. Twenty interviews, about 8 of them with the wrong people, can't settle whether a narrower version of the product fixes that problem.</w:t>
+      </w:r>
+    </w:p>
+    <w:p>
+      <w:pPr>
+        <w:pStyle w:val="Heading1"/>
+      </w:pPr>
+      <w:r>
+        <w:t xml:space="preserve">Point-by-point scorecard</w:t>
+      </w:r>
+    </w:p>
+    <w:tbl>
+      <w:tblPr>
+        <w:tblW w:w="10080" w:type="dxa"/>
+        <w:tblBorders>
+          <w:top w:val="single" w:sz="4" w:space="0" w:color="C9CCD1"/>
+          <w:left w:val="single" w:sz="4" w:space="0" w:color="C9CCD1"/>
+          <w:bottom w:val="single" w:sz="4" w:space="0" w:color="C9CCD1"/>
+          <w:right w:val="single" w:sz="4" w:space="0" w:color="C9CCD1"/>
+          <w:insideH w:val="single" w:sz="4" w:space="0" w:color="C9CCD1"/>
+          <w:insideV w:val="single" w:sz="4" w:space="0" w:color="C9CCD1"/>
+        </w:tblBorders>
+        <w:tblLayout w:type="fixed"/>
+      </w:tblPr>
+      <w:tblGrid>
+        <w:gridCol w:w="1680"/>
+        <w:gridCol w:w="1680"/>
+        <w:gridCol w:w="1680"/>
+        <w:gridCol w:w="1680"/>
+        <w:gridCol w:w="1680"/>
+        <w:gridCol w:w="1680"/>
+      </w:tblGrid>
+      <w:tr>
+        <w:trPr>
+          <w:tblHeader/>
+        </w:trPr>
+        <w:tc>
+          <w:tcPr>
+            <w:tcW w:w="1680" w:type="dxa"/>
+            <w:shd w:val="clear" w:color="auto" w:fill="EFF1F3"/>
+          </w:tcPr>
+          <w:p>
+            <w:pPr>
+              <w:spacing w:before="40" w:after="40"/>
+            </w:pPr>
+            <w:r>
+              <w:rPr>
+                <w:b/>
+                <w:sz w:val="18"/>
+              </w:rPr>
+              <w:t xml:space="preserve">#</w:t>
+            </w:r>
+          </w:p>
+        </w:tc>
+        <w:tc>
+          <w:tcPr>
+            <w:tcW w:w="1680" w:type="dxa"/>
+            <w:shd w:val="clear" w:color="auto" w:fill="EFF1F3"/>
+          </w:tcPr>
+          <w:p>
+            <w:pPr>
+              <w:spacing w:before="40" w:after="40"/>
+            </w:pPr>
+            <w:r>
+              <w:rPr>
+                <w:b/>
+                <w:sz w:val="18"/>
+              </w:rPr>
+              <w:t xml:space="preserve">Question</w:t>
+            </w:r>
+          </w:p>
+        </w:tc>
+        <w:tc>
+          <w:tcPr>
+            <w:tcW w:w="1680" w:type="dxa"/>
+            <w:shd w:val="clear" w:color="auto" w:fill="EFF1F3"/>
+          </w:tcPr>
+          <w:p>
+            <w:pPr>
+              <w:spacing w:before="40" w:after="40"/>
+            </w:pPr>
+            <w:r>
+              <w:rPr>
+                <w:b/>
+                <w:sz w:val="18"/>
+              </w:rPr>
+              <w:t xml:space="preserve">Case against</w:t>
+            </w:r>
+          </w:p>
+        </w:tc>
+        <w:tc>
+          <w:tcPr>
+            <w:tcW w:w="1680" w:type="dxa"/>
+            <w:shd w:val="clear" w:color="auto" w:fill="EFF1F3"/>
+          </w:tcPr>
+          <w:p>
+            <w:pPr>
+              <w:spacing w:before="40" w:after="40"/>
+            </w:pPr>
+            <w:r>
+              <w:rPr>
+                <w:b/>
+                <w:sz w:val="18"/>
+              </w:rPr>
+              <w:t xml:space="preserve">Case for</w:t>
+            </w:r>
+          </w:p>
+        </w:tc>
+        <w:tc>
+          <w:tcPr>
+            <w:tcW w:w="1680" w:type="dxa"/>
+            <w:shd w:val="clear" w:color="auto" w:fill="EFF1F3"/>
+          </w:tcPr>
+          <w:p>
+            <w:pPr>
+              <w:spacing w:before="40" w:after="40"/>
+            </w:pPr>
+            <w:r>
+              <w:rPr>
+                <w:b/>
+                <w:sz w:val="18"/>
+              </w:rPr>
+              <w:t xml:space="preserve">Who wins</w:t>
+            </w:r>
+          </w:p>
+        </w:tc>
+        <w:tc>
+          <w:tcPr>
+            <w:tcW w:w="1680" w:type="dxa"/>
+            <w:shd w:val="clear" w:color="auto" w:fill="EFF1F3"/>
+          </w:tcPr>
+          <w:p>
+            <w:pPr>
+              <w:spacing w:before="40" w:after="40"/>
+            </w:pPr>
+            <w:r>
+              <w:rPr>
+                <w:b/>
+                <w:sz w:val="18"/>
+              </w:rPr>
+              <w:t xml:space="preserve">Why</w:t>
+            </w:r>
+          </w:p>
+        </w:tc>
+      </w:tr>
+      <w:tr>
+        <w:tc>
+          <w:tcPr>
+            <w:tcW w:w="1680" w:type="dxa"/>
+          </w:tcPr>
+          <w:p>
+            <w:pPr>
+              <w:spacing w:before="40" w:after="40"/>
+            </w:pPr>
+            <w:r>
+              <w:rPr>
+                <w:sz w:val="18"/>
+              </w:rPr>
+              <w:t xml:space="preserve">1</w:t>
+            </w:r>
+          </w:p>
+        </w:tc>
+        <w:tc>
+          <w:tcPr>
+            <w:tcW w:w="1680" w:type="dxa"/>
+          </w:tcPr>
+          <w:p>
+            <w:pPr>
+              <w:spacing w:before="40" w:after="40"/>
+            </w:pPr>
+            <w:r>
+              <w:rPr>
+                <w:sz w:val="18"/>
+              </w:rPr>
+              <w:t xml:space="preserve">Is there a frequent, costly pain?</w:t>
+            </w:r>
+          </w:p>
+        </w:tc>
+        <w:tc>
+          <w:tcPr>
+            <w:tcW w:w="1680" w:type="dxa"/>
+          </w:tcPr>
+          <w:p>
+            <w:pPr>
+              <w:spacing w:before="40" w:after="40"/>
+            </w:pPr>
+            <w:r>
+              <w:rPr>
+                <w:sz w:val="18"/>
+              </w:rPr>
+              <w:t xml:space="preserve">Agrees the pain is real</w:t>
+            </w:r>
+          </w:p>
+        </w:tc>
+        <w:tc>
+          <w:tcPr>
+            <w:tcW w:w="1680" w:type="dxa"/>
+          </w:tcPr>
+          <w:p>
+            <w:pPr>
+              <w:spacing w:before="40" w:after="40"/>
+            </w:pPr>
+            <w:r>
+              <w:rPr>
+                <w:sz w:val="18"/>
+              </w:rPr>
+              <w:t xml:space="preserve">Running out of time or energy is the top pain (12 of 20)</w:t>
+            </w:r>
+          </w:p>
+        </w:tc>
+        <w:tc>
+          <w:tcPr>
+            <w:tcW w:w="1680" w:type="dxa"/>
+          </w:tcPr>
+          <w:p>
+            <w:pPr>
+              <w:spacing w:before="40" w:after="40"/>
+            </w:pPr>
+            <w:r>
+              <w:rPr>
+                <w:b/>
+                <w:sz w:val="18"/>
+              </w:rPr>
+              <w:t xml:space="preserve">For</w:t>
+            </w:r>
+          </w:p>
+        </w:tc>
+        <w:tc>
+          <w:tcPr>
+            <w:tcW w:w="1680" w:type="dxa"/>
+          </w:tcPr>
+          <w:p>
+            <w:pPr>
+              <w:spacing w:before="40" w:after="40"/>
+            </w:pPr>
+            <w:r>
+              <w:rPr>
+                <w:sz w:val="18"/>
+              </w:rPr>
+              <w:t xml:space="preserve">Both cases accept it. It's the strongest finding in the round.</w:t>
+            </w:r>
+          </w:p>
+        </w:tc>
+      </w:tr>
+      <w:tr>
+        <w:tc>
+          <w:tcPr>
+            <w:tcW w:w="1680" w:type="dxa"/>
+          </w:tcPr>
+          <w:p>
+            <w:pPr>
+              <w:spacing w:before="40" w:after="40"/>
+            </w:pPr>
+            <w:r>
+              <w:rPr>
+                <w:sz w:val="18"/>
+              </w:rPr>
+              <w:t xml:space="preserve">2</w:t>
+            </w:r>
+          </w:p>
+        </w:tc>
+        <w:tc>
+          <w:tcPr>
+            <w:tcW w:w="1680" w:type="dxa"/>
+          </w:tcPr>
+          <w:p>
+            <w:pPr>
+              <w:spacing w:before="40" w:after="40"/>
+            </w:pPr>
+            <w:r>
+              <w:rPr>
+                <w:sz w:val="18"/>
+              </w:rPr>
+              <w:t xml:space="preserve">Does HushPlate act where things go wrong?</w:t>
+            </w:r>
+          </w:p>
+        </w:tc>
+        <w:tc>
+          <w:tcPr>
+            <w:tcW w:w="1680" w:type="dxa"/>
+          </w:tcPr>
+          <w:p>
+            <w:pPr>
+              <w:spacing w:before="40" w:after="40"/>
+            </w:pPr>
+            <w:r>
+              <w:rPr>
+                <w:sz w:val="18"/>
+              </w:rPr>
+              <w:t xml:space="preserve">1 of 19 failure days prevented</w:t>
+            </w:r>
+          </w:p>
+        </w:tc>
+        <w:tc>
+          <w:tcPr>
+            <w:tcW w:w="1680" w:type="dxa"/>
+          </w:tcPr>
+          <w:p>
+            <w:pPr>
+              <w:spacing w:before="40" w:after="40"/>
+            </w:pPr>
+            <w:r>
+              <w:rPr>
+                <w:sz w:val="18"/>
+              </w:rPr>
+              <w:t xml:space="preserve">Up to 7 of 19 when you count what came before each failure</w:t>
+            </w:r>
+          </w:p>
+        </w:tc>
+        <w:tc>
+          <w:tcPr>
+            <w:tcW w:w="1680" w:type="dxa"/>
+          </w:tcPr>
+          <w:p>
+            <w:pPr>
+              <w:spacing w:before="40" w:after="40"/>
+            </w:pPr>
+            <w:r>
+              <w:rPr>
+                <w:b/>
+                <w:sz w:val="18"/>
+              </w:rPr>
+              <w:t xml:space="preserve">Against</w:t>
+            </w:r>
+          </w:p>
+        </w:tc>
+        <w:tc>
+          <w:tcPr>
+            <w:tcW w:w="1680" w:type="dxa"/>
+          </w:tcPr>
+          <w:p>
+            <w:pPr>
+              <w:spacing w:before="40" w:after="40"/>
+            </w:pPr>
+            <w:r>
+              <w:rPr>
+                <w:sz w:val="18"/>
+              </w:rPr>
+              <w:t xml:space="preserve">Even the generous count leaves 12 of 19 failure days (63%) untouched. Most failures happen after the food is in the house.</w:t>
+            </w:r>
+          </w:p>
+        </w:tc>
+      </w:tr>
+      <w:tr>
+        <w:tc>
+          <w:tcPr>
+            <w:tcW w:w="1680" w:type="dxa"/>
+          </w:tcPr>
+          <w:p>
+            <w:pPr>
+              <w:spacing w:before="40" w:after="40"/>
+            </w:pPr>
+            <w:r>
+              <w:rPr>
+                <w:sz w:val="18"/>
+              </w:rPr>
+              <w:t xml:space="preserve">3</w:t>
+            </w:r>
+          </w:p>
+        </w:tc>
+        <w:tc>
+          <w:tcPr>
+            <w:tcW w:w="1680" w:type="dxa"/>
+          </w:tcPr>
+          <w:p>
+            <w:pPr>
+              <w:spacing w:before="40" w:after="40"/>
+            </w:pPr>
+            <w:r>
+              <w:rPr>
+                <w:sz w:val="18"/>
+              </w:rPr>
+              <w:t xml:space="preserve">Is the lack of a plan the bottleneck?</w:t>
+            </w:r>
+          </w:p>
+        </w:tc>
+        <w:tc>
+          <w:tcPr>
+            <w:tcW w:w="1680" w:type="dxa"/>
+          </w:tcPr>
+          <w:p>
+            <w:pPr>
+              <w:spacing w:before="40" w:after="40"/>
+            </w:pPr>
+            <w:r>
+              <w:rPr>
+                <w:sz w:val="18"/>
+              </w:rPr>
+              <w:t xml:space="preserve">9 of 20 blame discipline; I1 and I2 have plans and still don't follow them</w:t>
+            </w:r>
+          </w:p>
+        </w:tc>
+        <w:tc>
+          <w:tcPr>
+            <w:tcW w:w="1680" w:type="dxa"/>
+          </w:tcPr>
+          <w:p>
+            <w:pPr>
+              <w:spacing w:before="40" w:after="40"/>
+            </w:pPr>
+            <w:r>
+              <w:rPr>
+                <w:sz w:val="18"/>
+              </w:rPr>
+              <w:t xml:space="preserve">People who plan ahead stay on track (I7, I12, I16, I17)</w:t>
+            </w:r>
+          </w:p>
+        </w:tc>
+        <w:tc>
+          <w:tcPr>
+            <w:tcW w:w="1680" w:type="dxa"/>
+          </w:tcPr>
+          <w:p>
+            <w:pPr>
+              <w:spacing w:before="40" w:after="40"/>
+            </w:pPr>
+            <w:r>
+              <w:rPr>
+                <w:b/>
+                <w:sz w:val="18"/>
+              </w:rPr>
+              <w:t xml:space="preserve">Against, narrowly</w:t>
+            </w:r>
+          </w:p>
+        </w:tc>
+        <w:tc>
+          <w:tcPr>
+            <w:tcW w:w="1680" w:type="dxa"/>
+          </w:tcPr>
+          <w:p>
+            <w:pPr>
+              <w:spacing w:before="40" w:after="40"/>
+            </w:pPr>
+            <w:r>
+              <w:rPr>
+                <w:sz w:val="18"/>
+              </w:rPr>
+              <w:t xml:space="preserve">Most of the people who plan well aren't struggling dieters (I12, I17), so planning may come from being disciplined rather than causing it. The real support comes from just three people (I1, I4, I16).</w:t>
+            </w:r>
+          </w:p>
+        </w:tc>
+      </w:tr>
+      <w:tr>
+        <w:tc>
+          <w:tcPr>
+            <w:tcW w:w="1680" w:type="dxa"/>
+          </w:tcPr>
+          <w:p>
+            <w:pPr>
+              <w:spacing w:before="40" w:after="40"/>
+            </w:pPr>
+            <w:r>
+              <w:rPr>
+                <w:sz w:val="18"/>
+              </w:rPr>
+              <w:t xml:space="preserve">4</w:t>
+            </w:r>
+          </w:p>
+        </w:tc>
+        <w:tc>
+          <w:tcPr>
+            <w:tcW w:w="1680" w:type="dxa"/>
+          </w:tcPr>
+          <w:p>
+            <w:pPr>
+              <w:spacing w:before="40" w:after="40"/>
+            </w:pPr>
+            <w:r>
+              <w:rPr>
+                <w:sz w:val="18"/>
+              </w:rPr>
+              <w:t xml:space="preserve">Do people juggle apps?</w:t>
+            </w:r>
+          </w:p>
+        </w:tc>
+        <w:tc>
+          <w:tcPr>
+            <w:tcW w:w="1680" w:type="dxa"/>
+          </w:tcPr>
+          <w:p>
+            <w:pPr>
+              <w:spacing w:before="40" w:after="40"/>
+            </w:pPr>
+            <w:r>
+              <w:rPr>
+                <w:sz w:val="18"/>
+              </w:rPr>
+              <w:t xml:space="preserve">Nobody tracks food in an app regularly</w:t>
+            </w:r>
+          </w:p>
+        </w:tc>
+        <w:tc>
+          <w:tcPr>
+            <w:tcW w:w="1680" w:type="dxa"/>
+          </w:tcPr>
+          <w:p>
+            <w:pPr>
+              <w:spacing w:before="40" w:after="40"/>
+            </w:pPr>
+            <w:r>
+              <w:rPr>
+                <w:sz w:val="18"/>
+              </w:rPr>
+              <w:t xml:space="preserve">The juggling happens across TikTok, ChatGPT, paper and people's heads</w:t>
+            </w:r>
+          </w:p>
+        </w:tc>
+        <w:tc>
+          <w:tcPr>
+            <w:tcW w:w="1680" w:type="dxa"/>
+          </w:tcPr>
+          <w:p>
+            <w:pPr>
+              <w:spacing w:before="40" w:after="40"/>
+            </w:pPr>
+            <w:r>
+              <w:rPr>
+                <w:b/>
+                <w:sz w:val="18"/>
+              </w:rPr>
+              <w:t xml:space="preserve">Against</w:t>
+            </w:r>
+          </w:p>
+        </w:tc>
+        <w:tc>
+          <w:tcPr>
+            <w:tcW w:w="1680" w:type="dxa"/>
+          </w:tcPr>
+          <w:p>
+            <w:pPr>
+              <w:spacing w:before="40" w:after="40"/>
+            </w:pPr>
+            <w:r>
+              <w:rPr>
+                <w:sz w:val="18"/>
+              </w:rPr>
+              <w:t xml:space="preserve">The landing-page claim about trackers and grocery apps has no support. Recipe-hopping shows up in 3 interviews.</w:t>
+            </w:r>
+          </w:p>
+        </w:tc>
+      </w:tr>
+      <w:tr>
+        <w:tc>
+          <w:tcPr>
+            <w:tcW w:w="1680" w:type="dxa"/>
+          </w:tcPr>
+          <w:p>
+            <w:pPr>
+              <w:spacing w:before="40" w:after="40"/>
+            </w:pPr>
+            <w:r>
+              <w:rPr>
+                <w:sz w:val="18"/>
+              </w:rPr>
+              <w:t xml:space="preserve">5</w:t>
+            </w:r>
+          </w:p>
+        </w:tc>
+        <w:tc>
+          <w:tcPr>
+            <w:tcW w:w="1680" w:type="dxa"/>
+          </w:tcPr>
+          <w:p>
+            <w:pPr>
+              <w:spacing w:before="40" w:after="40"/>
+            </w:pPr>
+            <w:r>
+              <w:rPr>
+                <w:sz w:val="18"/>
+              </w:rPr>
+              <w:t xml:space="preserve">Do targets matter?</w:t>
+            </w:r>
+          </w:p>
+        </w:tc>
+        <w:tc>
+          <w:tcPr>
+            <w:tcW w:w="1680" w:type="dxa"/>
+          </w:tcPr>
+          <w:p>
+            <w:pPr>
+              <w:spacing w:before="40" w:after="40"/>
+            </w:pPr>
+            <w:r>
+              <w:rPr>
+                <w:sz w:val="18"/>
+              </w:rPr>
+              <w:t xml:space="preserve">Tracked in people's heads; nobody complained</w:t>
+            </w:r>
+          </w:p>
+        </w:tc>
+        <w:tc>
+          <w:tcPr>
+            <w:tcW w:w="1680" w:type="dxa"/>
+          </w:tcPr>
+          <w:p>
+            <w:pPr>
+              <w:spacing w:before="40" w:after="40"/>
+            </w:pPr>
+            <w:r>
+              <w:rPr>
+                <w:sz w:val="18"/>
+              </w:rPr>
+              <w:t xml:space="preserve">8 of 20 manage protein, macros or fiber by hand</w:t>
+            </w:r>
+          </w:p>
+        </w:tc>
+        <w:tc>
+          <w:tcPr>
+            <w:tcW w:w="1680" w:type="dxa"/>
+          </w:tcPr>
+          <w:p>
+            <w:pPr>
+              <w:spacing w:before="40" w:after="40"/>
+            </w:pPr>
+            <w:r>
+              <w:rPr>
+                <w:b/>
+                <w:sz w:val="18"/>
+              </w:rPr>
+              <w:t xml:space="preserve">For</w:t>
+            </w:r>
+          </w:p>
+        </w:tc>
+        <w:tc>
+          <w:tcPr>
+            <w:tcW w:w="1680" w:type="dxa"/>
+          </w:tcPr>
+          <w:p>
+            <w:pPr>
+              <w:spacing w:before="40" w:after="40"/>
+            </w:pPr>
+            <w:r>
+              <w:rPr>
+                <w:sz w:val="18"/>
+              </w:rPr>
+              <w:t xml:space="preserve">It's real behavior, but it's low pain. People are coping in their heads.</w:t>
+            </w:r>
+          </w:p>
+        </w:tc>
+      </w:tr>
+      <w:tr>
+        <w:tc>
+          <w:tcPr>
+            <w:tcW w:w="1680" w:type="dxa"/>
+          </w:tcPr>
+          <w:p>
+            <w:pPr>
+              <w:spacing w:before="40" w:after="40"/>
+            </w:pPr>
+            <w:r>
+              <w:rPr>
+                <w:sz w:val="18"/>
+              </w:rPr>
+              <w:t xml:space="preserve">6</w:t>
+            </w:r>
+          </w:p>
+        </w:tc>
+        <w:tc>
+          <w:tcPr>
+            <w:tcW w:w="1680" w:type="dxa"/>
+          </w:tcPr>
+          <w:p>
+            <w:pPr>
+              <w:spacing w:before="40" w:after="40"/>
+            </w:pPr>
+            <w:r>
+              <w:rPr>
+                <w:sz w:val="18"/>
+              </w:rPr>
+              <w:t xml:space="preserve">Will people order online through an agent?</w:t>
+            </w:r>
+          </w:p>
+        </w:tc>
+        <w:tc>
+          <w:tcPr>
+            <w:tcW w:w="1680" w:type="dxa"/>
+          </w:tcPr>
+          <w:p>
+            <w:pPr>
+              <w:spacing w:before="40" w:after="40"/>
+            </w:pPr>
+            <w:r>
+              <w:rPr>
+                <w:sz w:val="18"/>
+              </w:rPr>
+              <w:t xml:space="preserve">Nobody uses delivery; 7 of 20 shop at several stores</w:t>
+            </w:r>
+          </w:p>
+        </w:tc>
+        <w:tc>
+          <w:tcPr>
+            <w:tcW w:w="1680" w:type="dxa"/>
+          </w:tcPr>
+          <w:p>
+            <w:pPr>
+              <w:spacing w:before="40" w:after="40"/>
+            </w:pPr>
+            <w:r>
+              <w:rPr>
+                <w:sz w:val="18"/>
+              </w:rPr>
+              <w:t xml:space="preserve">6 of 20 use some digital channel; I7 already builds pickup orders</w:t>
+            </w:r>
+          </w:p>
+        </w:tc>
+        <w:tc>
+          <w:tcPr>
+            <w:tcW w:w="1680" w:type="dxa"/>
+          </w:tcPr>
+          <w:p>
+            <w:pPr>
+              <w:spacing w:before="40" w:after="40"/>
+            </w:pPr>
+            <w:r>
+              <w:rPr>
+                <w:b/>
+                <w:sz w:val="18"/>
+              </w:rPr>
+              <w:t xml:space="preserve">Against, narrowly</w:t>
+            </w:r>
+          </w:p>
+        </w:tc>
+        <w:tc>
+          <w:tcPr>
+            <w:tcW w:w="1680" w:type="dxa"/>
+          </w:tcPr>
+          <w:p>
+            <w:pPr>
+              <w:spacing w:before="40" w:after="40"/>
+            </w:pPr>
+            <w:r>
+              <w:rPr>
+                <w:sz w:val="18"/>
+              </w:rPr>
+              <w:t xml:space="preserve">Only I7 does a full digital cart regularly. Curbside on busy days (I3, I4) is a real pattern, but it's rare.</w:t>
+            </w:r>
+          </w:p>
+        </w:tc>
+      </w:tr>
+      <w:tr>
+        <w:tc>
+          <w:tcPr>
+            <w:tcW w:w="1680" w:type="dxa"/>
+          </w:tcPr>
+          <w:p>
+            <w:pPr>
+              <w:spacing w:before="40" w:after="40"/>
+            </w:pPr>
+            <w:r>
+              <w:rPr>
+                <w:sz w:val="18"/>
+              </w:rPr>
+              <w:t xml:space="preserve">7</w:t>
+            </w:r>
+          </w:p>
+        </w:tc>
+        <w:tc>
+          <w:tcPr>
+            <w:tcW w:w="1680" w:type="dxa"/>
+          </w:tcPr>
+          <w:p>
+            <w:pPr>
+              <w:spacing w:before="40" w:after="40"/>
+            </w:pPr>
+            <w:r>
+              <w:rPr>
+                <w:sz w:val="18"/>
+              </w:rPr>
+              <w:t xml:space="preserve">Do they want it done for them?</w:t>
+            </w:r>
+          </w:p>
+        </w:tc>
+        <w:tc>
+          <w:tcPr>
+            <w:tcW w:w="1680" w:type="dxa"/>
+          </w:tcPr>
+          <w:p>
+            <w:pPr>
+              <w:spacing w:before="40" w:after="40"/>
+            </w:pPr>
+            <w:r>
+              <w:rPr>
+                <w:sz w:val="18"/>
+              </w:rPr>
+              <w:t xml:space="preserve">Five tried a food app and dropped it</w:t>
+            </w:r>
+          </w:p>
+        </w:tc>
+        <w:tc>
+          <w:tcPr>
+            <w:tcW w:w="1680" w:type="dxa"/>
+          </w:tcPr>
+          <w:p>
+            <w:pPr>
+              <w:spacing w:before="40" w:after="40"/>
+            </w:pPr>
+            <w:r>
+              <w:rPr>
+                <w:sz w:val="18"/>
+              </w:rPr>
+              <w:t xml:space="preserve">"If I had a way to do if for me it would be easier" (I1); I13 looked for automation; I4 and I10 mention AI</w:t>
+            </w:r>
+          </w:p>
+        </w:tc>
+        <w:tc>
+          <w:tcPr>
+            <w:tcW w:w="1680" w:type="dxa"/>
+          </w:tcPr>
+          <w:p>
+            <w:pPr>
+              <w:spacing w:before="40" w:after="40"/>
+            </w:pPr>
+            <w:r>
+              <w:rPr>
+                <w:b/>
+                <w:sz w:val="18"/>
+              </w:rPr>
+              <w:t xml:space="preserve">Tie</w:t>
+            </w:r>
+          </w:p>
+        </w:tc>
+        <w:tc>
+          <w:tcPr>
+            <w:tcW w:w="1680" w:type="dxa"/>
+          </w:tcPr>
+          <w:p>
+            <w:pPr>
+              <w:spacing w:before="40" w:after="40"/>
+            </w:pPr>
+            <w:r>
+              <w:rPr>
+                <w:sz w:val="18"/>
+              </w:rPr>
+              <w:t xml:space="preserve">The asks are hypothetical, and quitting apps is something people actually did. Each cancels the other out.</w:t>
+            </w:r>
+          </w:p>
+        </w:tc>
+      </w:tr>
+      <w:tr>
+        <w:tc>
+          <w:tcPr>
+            <w:tcW w:w="1680" w:type="dxa"/>
+          </w:tcPr>
+          <w:p>
+            <w:pPr>
+              <w:spacing w:before="40" w:after="40"/>
+            </w:pPr>
+            <w:r>
+              <w:rPr>
+                <w:sz w:val="18"/>
+              </w:rPr>
+              <w:t xml:space="preserve">8</w:t>
+            </w:r>
+          </w:p>
+        </w:tc>
+        <w:tc>
+          <w:tcPr>
+            <w:tcW w:w="1680" w:type="dxa"/>
+          </w:tcPr>
+          <w:p>
+            <w:pPr>
+              <w:spacing w:before="40" w:after="40"/>
+            </w:pPr>
+            <w:r>
+              <w:rPr>
+                <w:sz w:val="18"/>
+              </w:rPr>
+              <w:t xml:space="preserve">Will they pay?</w:t>
+            </w:r>
+          </w:p>
+        </w:tc>
+        <w:tc>
+          <w:tcPr>
+            <w:tcW w:w="1680" w:type="dxa"/>
+          </w:tcPr>
+          <w:p>
+            <w:pPr>
+              <w:spacing w:before="40" w:after="40"/>
+            </w:pPr>
+            <w:r>
+              <w:rPr>
+                <w:sz w:val="18"/>
+              </w:rPr>
+              <w:t xml:space="preserve">Nobody pays for a food app; 3 said outright they won't; Osta lost a subscriber at $3/month</w:t>
+            </w:r>
+          </w:p>
+        </w:tc>
+        <w:tc>
+          <w:tcPr>
+            <w:tcW w:w="1680" w:type="dxa"/>
+          </w:tcPr>
+          <w:p>
+            <w:pPr>
+              <w:spacing w:before="40" w:after="40"/>
+            </w:pPr>
+            <w:r>
+              <w:rPr>
+                <w:sz w:val="18"/>
+              </w:rPr>
+              <w:t xml:space="preserve">Money goes to GLP-1s, dietitians and premade food</w:t>
+            </w:r>
+          </w:p>
+        </w:tc>
+        <w:tc>
+          <w:tcPr>
+            <w:tcW w:w="1680" w:type="dxa"/>
+          </w:tcPr>
+          <w:p>
+            <w:pPr>
+              <w:spacing w:before="40" w:after="40"/>
+            </w:pPr>
+            <w:r>
+              <w:rPr>
+                <w:b/>
+                <w:sz w:val="18"/>
+              </w:rPr>
+              <w:t xml:space="preserve">Against</w:t>
+            </w:r>
+          </w:p>
+        </w:tc>
+        <w:tc>
+          <w:tcPr>
+            <w:tcW w:w="1680" w:type="dxa"/>
+          </w:tcPr>
+          <w:p>
+            <w:pPr>
+              <w:spacing w:before="40" w:after="40"/>
+            </w:pPr>
+            <w:r>
+              <w:rPr>
+                <w:sz w:val="18"/>
+              </w:rPr>
+              <w:t xml:space="preserve">That money goes to medication and food, not software. No interview shows anyone paying for planning.</w:t>
+            </w:r>
+          </w:p>
+        </w:tc>
+      </w:tr>
+      <w:tr>
+        <w:tc>
+          <w:tcPr>
+            <w:tcW w:w="1680" w:type="dxa"/>
+          </w:tcPr>
+          <w:p>
+            <w:pPr>
+              <w:spacing w:before="40" w:after="40"/>
+            </w:pPr>
+            <w:r>
+              <w:rPr>
+                <w:sz w:val="18"/>
+              </w:rPr>
+              <w:t xml:space="preserve">9</w:t>
+            </w:r>
+          </w:p>
+        </w:tc>
+        <w:tc>
+          <w:tcPr>
+            <w:tcW w:w="1680" w:type="dxa"/>
+          </w:tcPr>
+          <w:p>
+            <w:pPr>
+              <w:spacing w:before="40" w:after="40"/>
+            </w:pPr>
+            <w:r>
+              <w:rPr>
+                <w:sz w:val="18"/>
+              </w:rPr>
+              <w:t xml:space="preserve">Is the dieter the buyer?</w:t>
+            </w:r>
+          </w:p>
+        </w:tc>
+        <w:tc>
+          <w:tcPr>
+            <w:tcW w:w="1680" w:type="dxa"/>
+          </w:tcPr>
+          <w:p>
+            <w:pPr>
+              <w:spacing w:before="40" w:after="40"/>
+            </w:pPr>
+            <w:r>
+              <w:rPr>
+                <w:sz w:val="18"/>
+              </w:rPr>
+              <w:t xml:space="preserve">11 of 20 have someone else shopping, or cook for others</w:t>
+            </w:r>
+          </w:p>
+        </w:tc>
+        <w:tc>
+          <w:tcPr>
+            <w:tcW w:w="1680" w:type="dxa"/>
+          </w:tcPr>
+          <w:p>
+            <w:pPr>
+              <w:spacing w:before="40" w:after="40"/>
+            </w:pPr>
+            <w:r>
+              <w:rPr>
+                <w:sz w:val="18"/>
+              </w:rPr>
+              <w:t xml:space="preserve">A household plan is a bigger market; spouses are the shoppers</w:t>
+            </w:r>
+          </w:p>
+        </w:tc>
+        <w:tc>
+          <w:tcPr>
+            <w:tcW w:w="1680" w:type="dxa"/>
+          </w:tcPr>
+          <w:p>
+            <w:pPr>
+              <w:spacing w:before="40" w:after="40"/>
+            </w:pPr>
+            <w:r>
+              <w:rPr>
+                <w:b/>
+                <w:sz w:val="18"/>
+              </w:rPr>
+              <w:t xml:space="preserve">Unresolved</w:t>
+            </w:r>
+          </w:p>
+        </w:tc>
+        <w:tc>
+          <w:tcPr>
+            <w:tcW w:w="1680" w:type="dxa"/>
+          </w:tcPr>
+          <w:p>
+            <w:pPr>
+              <w:spacing w:before="40" w:after="40"/>
+            </w:pPr>
+            <w:r>
+              <w:rPr>
+                <w:sz w:val="18"/>
+              </w:rPr>
+              <w:t xml:space="preserve">Both are right. Either way, the current pitch aimed at one dieter is wrong, and the real customer is still unknown.</w:t>
+            </w:r>
+          </w:p>
+        </w:tc>
+      </w:tr>
+    </w:tbl>
+    <w:p>
+      <w:pPr>
+        <w:spacing w:after="0"/>
+      </w:pPr>
+    </w:p>
+    <w:p>
+      <w:r>
+        <w:rPr>
+          <w:b/>
+        </w:rPr>
+        <w:t xml:space="preserve">Score: Against 5, For 2, 1 tie, 1 unresolved.</w:t>
+      </w:r>
+    </w:p>
+    <w:p>
+      <w:pPr>
+        <w:pStyle w:val="Heading1"/>
+      </w:pPr>
+      <w:r>
+        <w:t xml:space="preserve">Why the case against wins on the current product</w:t>
+      </w:r>
+    </w:p>
+    <w:p>
+      <w:r>
+        <w:t xml:space="preserve">1. </w:t>
+      </w:r>
+      <w:r>
+        <w:rPr>
+          <w:b/>
+        </w:rPr>
+        <w:t xml:space="preserve">The timing problem is the deciding issue.</w:t>
+      </w:r>
+      <w:r>
+        <w:t xml:space="preserve"> HushPlate's job ends when the grocery cart is approved. Most failure days happen later, at the moment of cooking or eating: fatigue (I14, I18), cravings (I8, I9), illness (I16) and schedules (I12, I17). The case for's best rebuttal still leaves 63% of failure days untouched.</w:t>
+      </w:r>
+    </w:p>
+    <w:p>
+      <w:r>
+        <w:t xml:space="preserve">2. </w:t>
+      </w:r>
+      <w:r>
+        <w:rPr>
+          <w:b/>
+        </w:rPr>
+        <w:t xml:space="preserve">There's no evidence anyone would pay.</w:t>
+      </w:r>
+      <w:r>
+        <w:t xml:space="preserve"> The case for shows people spend money *near* this problem, not *on* it. Osta failing at $3/month is the closest comparison in the data, and it failed.</w:t>
+      </w:r>
+    </w:p>
+    <w:p>
+      <w:r>
+        <w:t xml:space="preserve">3. </w:t>
+      </w:r>
+      <w:r>
+        <w:rPr>
+          <w:b/>
+        </w:rPr>
+        <w:t xml:space="preserve">The landing-page pitch isn't supported.</w:t>
+      </w:r>
+      <w:r>
+        <w:t xml:space="preserve"> No interviewee described "juggling a tracker, a recipe app, and a grocery app." Whatever happens next, that sentence should go.</w:t>
+      </w:r>
+    </w:p>
+    <w:p>
+      <w:pPr>
+        <w:pStyle w:val="Heading1"/>
+      </w:pPr>
+      <w:r>
+        <w:t xml:space="preserve">What the case for gets right and shouldn't be thrown away</w:t>
+      </w:r>
+    </w:p>
+    <w:p>
+      <w:r>
+        <w:t xml:space="preserve">1. </w:t>
+      </w:r>
+      <w:r>
+        <w:rPr>
+          <w:b/>
+        </w:rPr>
+        <w:t xml:space="preserve">Running out of time and energy and grabbing fast food is the most common pain (12 of 20).</w:t>
+      </w:r>
+      <w:r>
+        <w:t xml:space="preserve"> I16 traced it directly to "not having energy to meal plan." That's a real problem with a real cost.</w:t>
+      </w:r>
+    </w:p>
+    <w:p>
+      <w:r>
+        <w:t xml:space="preserve">2. </w:t>
+      </w:r>
+      <w:r>
+        <w:rPr>
+          <w:b/>
+        </w:rPr>
+        <w:t xml:space="preserve">There's a user that fits:</w:t>
+      </w:r>
+      <w:r>
+        <w:t xml:space="preserve"> busy people who cook for a household and plan when they have time. I1, I3, I4, I7 and I16 fit most of it. Three of them have young children or a household to feed, and three use pickup or curbside.</w:t>
+      </w:r>
+    </w:p>
+    <w:p>
+      <w:r>
+        <w:t xml:space="preserve">3. </w:t>
+      </w:r>
+      <w:r>
+        <w:rPr>
+          <w:b/>
+        </w:rPr>
+        <w:t xml:space="preserve">Targets matter to 8 of 20, and allergies and restrictions came up without being asked</w:t>
+      </w:r>
+      <w:r>
+        <w:t xml:space="preserve"> (I13, I15, I16, I20). The profile part of HushPlate is aimed correctly. It just isn't the part people would pay for.</w:t>
+      </w:r>
+    </w:p>
+    <w:p>
+      <w:pPr>
+        <w:pStyle w:val="Heading1"/>
+      </w:pPr>
+      <w:r>
+        <w:t xml:space="preserve">What would settle it</w:t>
+      </w:r>
+    </w:p>
+    <w:p>
+      <w:r>
+        <w:t xml:space="preserve">Neither case can be settled with this sample. About 8 of 20 weren't dieting, only 2 are on a GLP-1, and there's no measured spending. Round 2 should fix those gaps and test the narrow version.</w:t>
+      </w:r>
+    </w:p>
+    <w:p>
+      <w:r>
+        <w:rPr>
+          <w:b/>
+        </w:rPr>
+        <w:t xml:space="preserve">Who to recruit (12–15 people):</w:t>
+      </w:r>
+    </w:p>
+    <w:p>
+      <w:pPr>
+        <w:numPr>
+          <w:ilvl w:val="0"/>
+          <w:numId w:val="1"/>
+        </w:numPr>
+      </w:pPr>
+      <w:r>
+        <w:t xml:space="preserve">Tried to lose weight in the last 6 months, with at least 5 on a GLP-1.</w:t>
+      </w:r>
+    </w:p>
+    <w:p>
+      <w:pPr>
+        <w:numPr>
+          <w:ilvl w:val="0"/>
+          <w:numId w:val="1"/>
+        </w:numPr>
+      </w:pPr>
+      <w:r>
+        <w:t xml:space="preserve">Does most of the shopping and cooking for a household of 2 or more.</w:t>
+      </w:r>
+    </w:p>
+    <w:p>
+      <w:pPr>
+        <w:numPr>
+          <w:ilvl w:val="0"/>
+          <w:numId w:val="1"/>
+        </w:numPr>
+      </w:pPr>
+      <w:r>
+        <w:t xml:space="preserve">Got takeout or fast food at least twice last week.</w:t>
+      </w:r>
+    </w:p>
+    <w:p>
+      <w:r>
+        <w:rPr>
+          <w:b/>
+        </w:rPr>
+        <w:t xml:space="preserve">Method:</w:t>
+      </w:r>
+    </w:p>
+    <w:p>
+      <w:r>
+        <w:t xml:space="preserve">1. Run the interview guide again with the fixes from the synthesis, and actually ask Q17 and Q20–Q26.</w:t>
+      </w:r>
+    </w:p>
+    <w:p>
+      <w:r>
+        <w:t xml:space="preserve">2. Then offer a </w:t>
+      </w:r>
+      <w:r>
+        <w:rPr>
+          <w:b/>
+        </w:rPr>
+        <w:t xml:space="preserve">hand-run test</w:t>
+      </w:r>
+      <w:r>
+        <w:t xml:space="preserve">. For two weeks, we build each person's weekly plan and a pickup cart at their store by hand. No app.</w:t>
+      </w:r>
+    </w:p>
+    <w:p>
+      <w:r>
+        <w:t xml:space="preserve">3. Ask for a small commitment up front, such as a refundable deposit or a booked planning session, rather than a yes to a survey.</w:t>
+      </w:r>
+    </w:p>
+    <w:p>
+      <w:r>
+        <w:rPr>
+          <w:b/>
+        </w:rPr>
+        <w:t xml:space="preserve">Go criteria. Build the narrow version if all three hold:</w:t>
+      </w:r>
+    </w:p>
+    <w:p>
+      <w:r>
+        <w:t xml:space="preserve">1. At least half describe a recent takeout day caused by having no plan or no groceries, without being prompted.</w:t>
+      </w:r>
+    </w:p>
+    <w:p>
+      <w:r>
+        <w:t xml:space="preserve">2. At least 60% of the hand-run test users actually place the pickup order we built, in </w:t>
+      </w:r>
+      <w:r>
+        <w:rPr>
+          <w:b/>
+        </w:rPr>
+        <w:t xml:space="preserve">both</w:t>
+      </w:r>
+      <w:r>
+        <w:t xml:space="preserve"> weeks.</w:t>
+      </w:r>
+    </w:p>
+    <w:p>
+      <w:r>
+        <w:t xml:space="preserve">3. At least a third make a paid or refundable commitment.</w:t>
+      </w:r>
+    </w:p>
+    <w:p>
+      <w:r>
+        <w:rPr>
+          <w:b/>
+        </w:rPr>
+        <w:t xml:space="preserve">Kill criteria. Stop work on the planning-and-cart idea if any of these hold:</w:t>
+      </w:r>
+    </w:p>
+    <w:p>
+      <w:r>
+        <w:t xml:space="preserve">1. Hand-run test users skip their order in week 2.</w:t>
+      </w:r>
+    </w:p>
+    <w:p>
+      <w:r>
+        <w:t xml:space="preserve">2. Failure stories are still mostly about after the food was home: cravings, fatigue at cooking time, illness.</w:t>
+      </w:r>
+    </w:p>
+    <w:p>
+      <w:r>
+        <w:t xml:space="preserve">3. Nobody commits money.</w:t>
+      </w:r>
+    </w:p>
+    <w:p>
+      <w:r>
+        <w:t xml:space="preserve">If it's killed, the fallback the evidence points to is the moment of cooking, not shopping. People already pay for premade and pre-marinated food to save effort (I7, I8, I13, I19). A plan built around quick or premade meals is the next idea to test.</w:t>
+      </w:r>
+    </w:p>
+    <w:p>
+      <w:pPr>
+        <w:pStyle w:val="Heading1"/>
+      </w:pPr>
+      <w:r>
+        <w:t xml:space="preserve">Bottom line</w:t>
+      </w:r>
+    </w:p>
+    <w:tbl>
+      <w:tblPr>
+        <w:tblW w:w="10080" w:type="dxa"/>
+        <w:tblBorders>
+          <w:top w:val="single" w:sz="4" w:space="0" w:color="C9CCD1"/>
+          <w:left w:val="single" w:sz="4" w:space="0" w:color="C9CCD1"/>
+          <w:bottom w:val="single" w:sz="4" w:space="0" w:color="C9CCD1"/>
+          <w:right w:val="single" w:sz="4" w:space="0" w:color="C9CCD1"/>
+          <w:insideH w:val="single" w:sz="4" w:space="0" w:color="C9CCD1"/>
+          <w:insideV w:val="single" w:sz="4" w:space="0" w:color="C9CCD1"/>
+        </w:tblBorders>
+        <w:tblLayout w:type="fixed"/>
+      </w:tblPr>
+      <w:tblGrid>
+        <w:gridCol w:w="5040"/>
+        <w:gridCol w:w="5040"/>
+      </w:tblGrid>
+      <w:tr>
+        <w:trPr>
+          <w:tblHeader/>
+        </w:trPr>
+        <w:tc>
+          <w:tcPr>
+            <w:tcW w:w="5040" w:type="dxa"/>
+            <w:shd w:val="clear" w:color="auto" w:fill="EFF1F3"/>
+          </w:tcPr>
+          <w:p>
+            <w:pPr>
+              <w:spacing w:before="40" w:after="40"/>
+            </w:pPr>
+            <w:r>
+              <w:rPr>
+                <w:b/>
+                <w:sz w:val="18"/>
+              </w:rPr>
+              <w:t xml:space="preserve">Question</w:t>
+            </w:r>
+          </w:p>
+        </w:tc>
+        <w:tc>
+          <w:tcPr>
+            <w:tcW w:w="5040" w:type="dxa"/>
+            <w:shd w:val="clear" w:color="auto" w:fill="EFF1F3"/>
+          </w:tcPr>
+          <w:p>
+            <w:pPr>
+              <w:spacing w:before="40" w:after="40"/>
+            </w:pPr>
+            <w:r>
+              <w:rPr>
+                <w:b/>
+                <w:sz w:val="18"/>
+              </w:rPr>
+              <w:t xml:space="preserve">Answer</w:t>
+            </w:r>
+          </w:p>
+        </w:tc>
+      </w:tr>
+      <w:tr>
+        <w:tc>
+          <w:tcPr>
+            <w:tcW w:w="5040" w:type="dxa"/>
+          </w:tcPr>
+          <w:p>
+            <w:pPr>
+              <w:spacing w:before="40" w:after="40"/>
+            </w:pPr>
+            <w:r>
+              <w:rPr>
+                <w:b/>
+                <w:sz w:val="18"/>
+              </w:rPr>
+              <w:t xml:space="preserve">Build HushPlate as pitched?</w:t>
+            </w:r>
+          </w:p>
+        </w:tc>
+        <w:tc>
+          <w:tcPr>
+            <w:tcW w:w="5040" w:type="dxa"/>
+          </w:tcPr>
+          <w:p>
+            <w:pPr>
+              <w:spacing w:before="40" w:after="40"/>
+            </w:pPr>
+            <w:r>
+              <w:rPr>
+                <w:sz w:val="18"/>
+              </w:rPr>
+              <w:t xml:space="preserve">No.</w:t>
+            </w:r>
+          </w:p>
+        </w:tc>
+      </w:tr>
+      <w:tr>
+        <w:tc>
+          <w:tcPr>
+            <w:tcW w:w="5040" w:type="dxa"/>
+          </w:tcPr>
+          <w:p>
+            <w:pPr>
+              <w:spacing w:before="40" w:after="40"/>
+            </w:pPr>
+            <w:r>
+              <w:rPr>
+                <w:b/>
+                <w:sz w:val="18"/>
+              </w:rPr>
+              <w:t xml:space="preserve">Is the problem real?</w:t>
+            </w:r>
+          </w:p>
+        </w:tc>
+        <w:tc>
+          <w:tcPr>
+            <w:tcW w:w="5040" w:type="dxa"/>
+          </w:tcPr>
+          <w:p>
+            <w:pPr>
+              <w:spacing w:before="40" w:after="40"/>
+            </w:pPr>
+            <w:r>
+              <w:rPr>
+                <w:sz w:val="18"/>
+              </w:rPr>
+              <w:t xml:space="preserve">Yes. Busy people run out of energy to plan and grab fast food (12 of 20).</w:t>
+            </w:r>
+          </w:p>
+        </w:tc>
+      </w:tr>
+      <w:tr>
+        <w:tc>
+          <w:tcPr>
+            <w:tcW w:w="5040" w:type="dxa"/>
+          </w:tcPr>
+          <w:p>
+            <w:pPr>
+              <w:spacing w:before="40" w:after="40"/>
+            </w:pPr>
+            <w:r>
+              <w:rPr>
+                <w:b/>
+                <w:sz w:val="18"/>
+              </w:rPr>
+              <w:t xml:space="preserve">What's the narrow bet?</w:t>
+            </w:r>
+          </w:p>
+        </w:tc>
+        <w:tc>
+          <w:tcPr>
+            <w:tcW w:w="5040" w:type="dxa"/>
+          </w:tcPr>
+          <w:p>
+            <w:pPr>
+              <w:spacing w:before="40" w:after="40"/>
+            </w:pPr>
+            <w:r>
+              <w:rPr>
+                <w:sz w:val="18"/>
+              </w:rPr>
+              <w:t xml:space="preserve">A household meal plan that holds one person's targets, turned into a pickup cart, for busy cooks who already use pickup or curbside.</w:t>
+            </w:r>
+          </w:p>
+        </w:tc>
+      </w:tr>
+      <w:tr>
+        <w:tc>
+          <w:tcPr>
+            <w:tcW w:w="5040" w:type="dxa"/>
+          </w:tcPr>
+          <w:p>
+            <w:pPr>
+              <w:spacing w:before="40" w:after="40"/>
+            </w:pPr>
+            <w:r>
+              <w:rPr>
+                <w:b/>
+                <w:sz w:val="18"/>
+              </w:rPr>
+              <w:t xml:space="preserve">What's next?</w:t>
+            </w:r>
+          </w:p>
+        </w:tc>
+        <w:tc>
+          <w:tcPr>
+            <w:tcW w:w="5040" w:type="dxa"/>
+          </w:tcPr>
+          <w:p>
+            <w:pPr>
+              <w:spacing w:before="40" w:after="40"/>
+            </w:pPr>
+            <w:r>
+              <w:rPr>
+                <w:sz w:val="18"/>
+              </w:rPr>
+              <w:t xml:space="preserve">Round 2 with the right people, a two-week hand-run test, and a money commitment. Go or kill based on the criteria above.</w:t>
+            </w:r>
+          </w:p>
+        </w:tc>
+      </w:tr>
+      <w:tr>
+        <w:tc>
+          <w:tcPr>
+            <w:tcW w:w="5040" w:type="dxa"/>
+          </w:tcPr>
+          <w:p>
+            <w:pPr>
+              <w:spacing w:before="40" w:after="40"/>
+            </w:pPr>
+            <w:r>
+              <w:rPr>
+                <w:b/>
+                <w:sz w:val="18"/>
+              </w:rPr>
+              <w:t xml:space="preserve">What changes now?</w:t>
+            </w:r>
+          </w:p>
+        </w:tc>
+        <w:tc>
+          <w:tcPr>
+            <w:tcW w:w="5040" w:type="dxa"/>
+          </w:tcPr>
+          <w:p>
+            <w:pPr>
+              <w:spacing w:before="40" w:after="40"/>
+            </w:pPr>
+            <w:r>
+              <w:rPr>
+                <w:sz w:val="18"/>
+              </w:rPr>
+              <w:t xml:space="preserve">Drop "juggling a tracker, a recipe app, and a grocery app" from the landing page. Lead with the time and energy problem instead.</w:t>
+            </w:r>
+          </w:p>
+        </w:tc>
+      </w:tr>
+    </w:tbl>
+    <w:p>
+      <w:pPr>
+        <w:spacing w:after="0"/>
+      </w:pPr>
     </w:p>
     <w:sectPr>
       <w:pgSz w:w="12240" w:h="15840"/>

</xml_diff>